<commit_message>
Aktualizacja zasad do v2
Zmiany w niektórych zdolnościach i silniku kosztów.
</commit_message>
<xml_diff>
--- a/app/static/docs/OPOS.docx
+++ b/app/static/docs/OPOS.docx
@@ -181,7 +181,21 @@
           <w:sz w:val="18"/>
           <w:szCs w:val="18"/>
         </w:rPr>
-        <w:t xml:space="preserve">podobny. </w:t>
+        <w:t>podobny</w:t>
+      </w:r>
+      <w:r>
+        <w:rPr>
+          <w:sz w:val="18"/>
+          <w:szCs w:val="18"/>
+        </w:rPr>
+        <w:t>m</w:t>
+      </w:r>
+      <w:r>
+        <w:rPr>
+          <w:sz w:val="18"/>
+          <w:szCs w:val="18"/>
+        </w:rPr>
+        <w:t xml:space="preserve">. </w:t>
       </w:r>
       <w:r>
         <w:rPr>
@@ -202,6 +216,13 @@
           <w:sz w:val="18"/>
           <w:szCs w:val="18"/>
         </w:rPr>
+        <w:t xml:space="preserve">równych </w:t>
+      </w:r>
+      <w:r>
+        <w:rPr>
+          <w:sz w:val="18"/>
+          <w:szCs w:val="18"/>
+        </w:rPr>
         <w:t>dłuższ</w:t>
       </w:r>
       <w:r>
@@ -209,7 +230,7 @@
           <w:sz w:val="18"/>
           <w:szCs w:val="18"/>
         </w:rPr>
-        <w:t>y</w:t>
+        <w:t>emu</w:t>
       </w:r>
       <w:r>
         <w:rPr>
@@ -269,7 +290,14 @@
           <w:sz w:val="18"/>
           <w:szCs w:val="18"/>
         </w:rPr>
-        <w:t>mają Obronę</w:t>
+        <w:t xml:space="preserve">mają </w:t>
+      </w:r>
+      <w:r>
+        <w:rPr>
+          <w:sz w:val="18"/>
+          <w:szCs w:val="18"/>
+        </w:rPr>
+        <w:t>Zbroję</w:t>
       </w:r>
       <w:r>
         <w:rPr>
@@ -283,14 +311,7 @@
           <w:sz w:val="18"/>
           <w:szCs w:val="18"/>
         </w:rPr>
-        <w:t>Wyt</w:t>
-      </w:r>
-      <w:r>
-        <w:rPr>
-          <w:sz w:val="18"/>
-          <w:szCs w:val="18"/>
-        </w:rPr>
-        <w:t>rzymałość</w:t>
+        <w:t>Życie</w:t>
       </w:r>
       <w:r>
         <w:rPr>
@@ -357,7 +378,77 @@
           <w:sz w:val="18"/>
           <w:szCs w:val="18"/>
         </w:rPr>
-        <w:t>y zasięg: wręcz, krótki (dwie miarki), daleki (powyżej dwóch miarek) oraz</w:t>
+        <w:t>y zasięg: wręcz, krótki (</w:t>
+      </w:r>
+      <w:r>
+        <w:rPr>
+          <w:sz w:val="18"/>
+          <w:szCs w:val="18"/>
+        </w:rPr>
+        <w:t>do</w:t>
+      </w:r>
+      <w:r>
+        <w:rPr>
+          <w:sz w:val="18"/>
+          <w:szCs w:val="18"/>
+        </w:rPr>
+        <w:t xml:space="preserve"> </w:t>
+      </w:r>
+      <w:r>
+        <w:rPr>
+          <w:sz w:val="18"/>
+          <w:szCs w:val="18"/>
+        </w:rPr>
+        <w:t>miark</w:t>
+      </w:r>
+      <w:r>
+        <w:rPr>
+          <w:sz w:val="18"/>
+          <w:szCs w:val="18"/>
+        </w:rPr>
+        <w:t>i</w:t>
+      </w:r>
+      <w:r>
+        <w:rPr>
+          <w:sz w:val="18"/>
+          <w:szCs w:val="18"/>
+        </w:rPr>
+        <w:t>, ale nie wręcz</w:t>
+      </w:r>
+      <w:r>
+        <w:rPr>
+          <w:sz w:val="18"/>
+          <w:szCs w:val="18"/>
+        </w:rPr>
+        <w:t>), daleki (</w:t>
+      </w:r>
+      <w:r>
+        <w:rPr>
+          <w:sz w:val="18"/>
+          <w:szCs w:val="18"/>
+        </w:rPr>
+        <w:t>więcej niż</w:t>
+      </w:r>
+      <w:r>
+        <w:rPr>
+          <w:sz w:val="18"/>
+          <w:szCs w:val="18"/>
+        </w:rPr>
+        <w:t xml:space="preserve"> miark</w:t>
+      </w:r>
+      <w:r>
+        <w:rPr>
+          <w:sz w:val="18"/>
+          <w:szCs w:val="18"/>
+        </w:rPr>
+        <w:t>a</w:t>
+      </w:r>
+      <w:r>
+        <w:rPr>
+          <w:sz w:val="18"/>
+          <w:szCs w:val="18"/>
+        </w:rPr>
+        <w:t>) oraz</w:t>
       </w:r>
       <w:r>
         <w:rPr>
@@ -438,7 +529,21 @@
           <w:sz w:val="18"/>
           <w:szCs w:val="18"/>
         </w:rPr>
-        <w:t xml:space="preserve">eżeli jest ich tyle lub więcej niż wytrzymałość </w:t>
+        <w:t xml:space="preserve">eżeli jest ich tyle lub więcej niż </w:t>
+      </w:r>
+      <w:r>
+        <w:rPr>
+          <w:sz w:val="18"/>
+          <w:szCs w:val="18"/>
+        </w:rPr>
+        <w:t>Życie</w:t>
+      </w:r>
+      <w:r>
+        <w:rPr>
+          <w:sz w:val="18"/>
+          <w:szCs w:val="18"/>
+        </w:rPr>
+        <w:t xml:space="preserve"> </w:t>
       </w:r>
       <w:r>
         <w:rPr>
@@ -452,7 +557,21 @@
           <w:sz w:val="18"/>
           <w:szCs w:val="18"/>
         </w:rPr>
-        <w:t xml:space="preserve"> i odrzucić tyle ran ile ma wytrzymałości.</w:t>
+        <w:t xml:space="preserve"> i odrzucić tyle ran ile ma </w:t>
+      </w:r>
+      <w:r>
+        <w:rPr>
+          <w:sz w:val="18"/>
+          <w:szCs w:val="18"/>
+        </w:rPr>
+        <w:t>Życia</w:t>
+      </w:r>
+      <w:r>
+        <w:rPr>
+          <w:sz w:val="18"/>
+          <w:szCs w:val="18"/>
+        </w:rPr>
+        <w:t>.</w:t>
       </w:r>
     </w:p>
     <w:p>
@@ -662,21 +781,35 @@
           <w:sz w:val="18"/>
           <w:szCs w:val="18"/>
         </w:rPr>
-        <w:t>Korzystny:</w:t>
-      </w:r>
-      <w:r>
-        <w:rPr>
-          <w:sz w:val="18"/>
-          <w:szCs w:val="18"/>
-        </w:rPr>
-        <w:t xml:space="preserve"> +1 do ataku na cele poza </w:t>
-      </w:r>
-      <w:r>
-        <w:rPr>
-          <w:sz w:val="18"/>
-          <w:szCs w:val="18"/>
-        </w:rPr>
-        <w:t>tym terenem.</w:t>
+        <w:t>Wysoki</w:t>
+      </w:r>
+      <w:r>
+        <w:rPr>
+          <w:sz w:val="18"/>
+          <w:szCs w:val="18"/>
+        </w:rPr>
+        <w:t xml:space="preserve"> +1 do ataku na cele </w:t>
+      </w:r>
+      <w:r>
+        <w:rPr>
+          <w:sz w:val="18"/>
+          <w:szCs w:val="18"/>
+        </w:rPr>
+        <w:t>poniżej</w:t>
+      </w:r>
+      <w:r>
+        <w:rPr>
+          <w:sz w:val="18"/>
+          <w:szCs w:val="18"/>
+        </w:rPr>
+        <w:t>.</w:t>
+      </w:r>
+      <w:r>
+        <w:rPr>
+          <w:sz w:val="18"/>
+          <w:szCs w:val="18"/>
+        </w:rPr>
+        <w:t xml:space="preserve"> Gdy oddział jest wręcz od jego krawędzi, może zamiast ruchu wejść lub zejść z niego.</w:t>
       </w:r>
     </w:p>
     <w:p>
@@ -729,7 +862,14 @@
           <w:sz w:val="18"/>
           <w:szCs w:val="18"/>
         </w:rPr>
-        <w:t xml:space="preserve">5 celów. </w:t>
+        <w:t>12</w:t>
+      </w:r>
+      <w:r>
+        <w:rPr>
+          <w:sz w:val="18"/>
+          <w:szCs w:val="18"/>
+        </w:rPr>
+        <w:t xml:space="preserve"> celów. </w:t>
       </w:r>
       <w:r>
         <w:rPr>
@@ -834,28 +974,21 @@
           <w:sz w:val="18"/>
           <w:szCs w:val="18"/>
         </w:rPr>
-        <w:t xml:space="preserve">Cel pozostaje zajęty, aż zajmie go przeciwnik. </w:t>
-      </w:r>
-      <w:r>
-        <w:rPr>
-          <w:sz w:val="18"/>
-          <w:szCs w:val="18"/>
-        </w:rPr>
-        <w:t xml:space="preserve">Gra kończy się po </w:t>
-      </w:r>
-      <w:r>
-        <w:rPr>
-          <w:sz w:val="18"/>
-          <w:szCs w:val="18"/>
-        </w:rPr>
-        <w:t>5</w:t>
-      </w:r>
-      <w:r>
-        <w:rPr>
-          <w:sz w:val="18"/>
-          <w:szCs w:val="18"/>
-        </w:rPr>
-        <w:t xml:space="preserve"> rundach. Wygrywa gracz, który na koniec kontroluje więcej celów.</w:t>
+        <w:t>Gra kończy się</w:t>
+      </w:r>
+      <w:r>
+        <w:rPr>
+          <w:sz w:val="18"/>
+          <w:szCs w:val="18"/>
+        </w:rPr>
+        <w:t>, gdy któryś gracz zdobył 6 celów, albo stracił wszystkie oddziały</w:t>
+      </w:r>
+      <w:r>
+        <w:rPr>
+          <w:sz w:val="18"/>
+          <w:szCs w:val="18"/>
+        </w:rPr>
+        <w:t>.</w:t>
       </w:r>
     </w:p>
     <w:p>
@@ -880,7 +1013,21 @@
           <w:sz w:val="18"/>
           <w:szCs w:val="18"/>
         </w:rPr>
-        <w:t xml:space="preserve"> Drugi z graczy wybiera jedną ze stref rozstawienia i rozpoczyna naprzemienne wystawianie oddziałów.</w:t>
+        <w:t xml:space="preserve"> Drugi gracz wybiera stref</w:t>
+      </w:r>
+      <w:r>
+        <w:rPr>
+          <w:sz w:val="18"/>
+          <w:szCs w:val="18"/>
+        </w:rPr>
+        <w:t>ę</w:t>
+      </w:r>
+      <w:r>
+        <w:rPr>
+          <w:sz w:val="18"/>
+          <w:szCs w:val="18"/>
+        </w:rPr>
+        <w:t xml:space="preserve"> rozstawienia i rozpoczyna naprzemienne wystawianie oddziałów.</w:t>
       </w:r>
       <w:r>
         <w:rPr>
@@ -1065,28 +1212,70 @@
           <w:sz w:val="18"/>
           <w:szCs w:val="18"/>
         </w:rPr>
-        <w:t xml:space="preserve"> i daje mu go</w:t>
-      </w:r>
-      <w:r>
-        <w:rPr>
-          <w:sz w:val="18"/>
-          <w:szCs w:val="18"/>
-        </w:rPr>
-        <w:t xml:space="preserve"> i wykonuje nim </w:t>
-      </w:r>
-      <w:r>
-        <w:rPr>
-          <w:sz w:val="18"/>
-          <w:szCs w:val="18"/>
-        </w:rPr>
-        <w:t>ruch i atak</w:t>
-      </w:r>
-      <w:r>
-        <w:rPr>
-          <w:sz w:val="18"/>
-          <w:szCs w:val="18"/>
-        </w:rPr>
-        <w:t xml:space="preserve"> w dowolnej kolejności</w:t>
+        <w:t xml:space="preserve">, </w:t>
+      </w:r>
+      <w:r>
+        <w:rPr>
+          <w:sz w:val="18"/>
+          <w:szCs w:val="18"/>
+        </w:rPr>
+        <w:t>daje mu go</w:t>
+      </w:r>
+      <w:r>
+        <w:rPr>
+          <w:sz w:val="18"/>
+          <w:szCs w:val="18"/>
+        </w:rPr>
+        <w:t xml:space="preserve"> i </w:t>
+      </w:r>
+      <w:r>
+        <w:rPr>
+          <w:sz w:val="18"/>
+          <w:szCs w:val="18"/>
+        </w:rPr>
+        <w:t xml:space="preserve">może </w:t>
+      </w:r>
+      <w:r>
+        <w:rPr>
+          <w:sz w:val="18"/>
+          <w:szCs w:val="18"/>
+        </w:rPr>
+        <w:t>wykon</w:t>
+      </w:r>
+      <w:r>
+        <w:rPr>
+          <w:sz w:val="18"/>
+          <w:szCs w:val="18"/>
+        </w:rPr>
+        <w:t>ać</w:t>
+      </w:r>
+      <w:r>
+        <w:rPr>
+          <w:sz w:val="18"/>
+          <w:szCs w:val="18"/>
+        </w:rPr>
+        <w:t xml:space="preserve"> nim </w:t>
+      </w:r>
+      <w:r>
+        <w:rPr>
+          <w:sz w:val="18"/>
+          <w:szCs w:val="18"/>
+        </w:rPr>
+        <w:t>ruch</w:t>
+      </w:r>
+      <w:r>
+        <w:rPr>
+          <w:sz w:val="18"/>
+          <w:szCs w:val="18"/>
+        </w:rPr>
+        <w:t>, a potem</w:t>
+      </w:r>
+      <w:r>
+        <w:rPr>
+          <w:sz w:val="18"/>
+          <w:szCs w:val="18"/>
+        </w:rPr>
+        <w:t xml:space="preserve"> atak</w:t>
       </w:r>
       <w:r>
         <w:rPr>
@@ -1125,14 +1314,21 @@
           <w:sz w:val="18"/>
           <w:szCs w:val="18"/>
         </w:rPr>
-        <w:t xml:space="preserve">Ruch: </w:t>
-      </w:r>
-      <w:r>
-        <w:rPr>
-          <w:sz w:val="18"/>
-          <w:szCs w:val="18"/>
-        </w:rPr>
-        <w:t xml:space="preserve">Przesuń każdy model </w:t>
+        <w:t>Ruch:</w:t>
+      </w:r>
+      <w:r>
+        <w:rPr>
+          <w:sz w:val="18"/>
+          <w:szCs w:val="18"/>
+        </w:rPr>
+        <w:t xml:space="preserve"> Jeżeli nie ma wroga wręcz, p</w:t>
+      </w:r>
+      <w:r>
+        <w:rPr>
+          <w:sz w:val="18"/>
+          <w:szCs w:val="18"/>
+        </w:rPr>
+        <w:t xml:space="preserve">rzesuń każdy model </w:t>
       </w:r>
       <w:r>
         <w:rPr>
@@ -1153,7 +1349,28 @@
           <w:sz w:val="18"/>
           <w:szCs w:val="18"/>
         </w:rPr>
-        <w:t>miarkę.</w:t>
+        <w:t>miark</w:t>
+      </w:r>
+      <w:r>
+        <w:rPr>
+          <w:sz w:val="18"/>
+          <w:szCs w:val="18"/>
+        </w:rPr>
+        <w:t>ę, tak</w:t>
+      </w:r>
+      <w:r>
+        <w:rPr>
+          <w:sz w:val="18"/>
+          <w:szCs w:val="18"/>
+        </w:rPr>
+        <w:t>, aby pozostały wręcz od siebie</w:t>
+      </w:r>
+      <w:r>
+        <w:rPr>
+          <w:sz w:val="18"/>
+          <w:szCs w:val="18"/>
+        </w:rPr>
+        <w:t>, a najdalsze były nie dalej niż miarkę od siebie.</w:t>
       </w:r>
       <w:r>
         <w:rPr>
@@ -1162,61 +1379,177 @@
         </w:rPr>
         <w:t xml:space="preserve"> </w:t>
       </w:r>
-      <w:r>
-        <w:rPr>
-          <w:sz w:val="18"/>
-          <w:szCs w:val="18"/>
-        </w:rPr>
-        <w:t>Każdy musi</w:t>
-      </w:r>
-      <w:r>
-        <w:rPr>
-          <w:sz w:val="18"/>
-          <w:szCs w:val="18"/>
-        </w:rPr>
-        <w:t xml:space="preserve"> pozostawać </w:t>
-      </w:r>
-      <w:r>
-        <w:rPr>
-          <w:sz w:val="18"/>
-          <w:szCs w:val="18"/>
-        </w:rPr>
-        <w:t>wręcz</w:t>
-      </w:r>
-      <w:r>
-        <w:rPr>
-          <w:sz w:val="18"/>
-          <w:szCs w:val="18"/>
-        </w:rPr>
-        <w:t xml:space="preserve"> od innego modelu z oddziału i </w:t>
-      </w:r>
-      <w:r>
-        <w:rPr>
-          <w:sz w:val="18"/>
-          <w:szCs w:val="18"/>
-        </w:rPr>
-        <w:t>miarkę</w:t>
-      </w:r>
-      <w:r>
-        <w:rPr>
-          <w:sz w:val="18"/>
-          <w:szCs w:val="18"/>
-        </w:rPr>
-        <w:t xml:space="preserve"> pozostałych </w:t>
-      </w:r>
-      <w:r>
-        <w:rPr>
-          <w:sz w:val="18"/>
-          <w:szCs w:val="18"/>
-        </w:rPr>
-        <w:t xml:space="preserve">jego </w:t>
-      </w:r>
-      <w:r>
-        <w:rPr>
-          <w:sz w:val="18"/>
-          <w:szCs w:val="18"/>
-        </w:rPr>
-        <w:t>modeli</w:t>
+    </w:p>
+    <w:p>
+      <w:pPr>
+        <w:spacing w:after="0"/>
+        <w:rPr>
+          <w:sz w:val="18"/>
+          <w:szCs w:val="18"/>
+        </w:rPr>
+      </w:pPr>
+      <w:r>
+        <w:rPr>
+          <w:b/>
+          <w:bCs/>
+          <w:sz w:val="18"/>
+          <w:szCs w:val="18"/>
+        </w:rPr>
+        <w:t>Atak:</w:t>
+      </w:r>
+      <w:r>
+        <w:rPr>
+          <w:sz w:val="18"/>
+          <w:szCs w:val="18"/>
+        </w:rPr>
+        <w:t xml:space="preserve"> </w:t>
+      </w:r>
+      <w:r>
+        <w:rPr>
+          <w:sz w:val="18"/>
+          <w:szCs w:val="18"/>
+        </w:rPr>
+        <w:t xml:space="preserve">Wybierz </w:t>
+      </w:r>
+      <w:r>
+        <w:rPr>
+          <w:sz w:val="18"/>
+          <w:szCs w:val="18"/>
+        </w:rPr>
+        <w:t>widoczny wrogi oddział</w:t>
+      </w:r>
+      <w:r>
+        <w:rPr>
+          <w:sz w:val="18"/>
+          <w:szCs w:val="18"/>
+        </w:rPr>
+        <w:t>, j</w:t>
+      </w:r>
+      <w:r>
+        <w:rPr>
+          <w:sz w:val="18"/>
+          <w:szCs w:val="18"/>
+        </w:rPr>
+        <w:t xml:space="preserve">eżeli </w:t>
+      </w:r>
+      <w:r>
+        <w:rPr>
+          <w:sz w:val="18"/>
+          <w:szCs w:val="18"/>
+        </w:rPr>
+        <w:t>masz</w:t>
+      </w:r>
+      <w:r>
+        <w:rPr>
+          <w:sz w:val="18"/>
+          <w:szCs w:val="18"/>
+        </w:rPr>
+        <w:t xml:space="preserve"> wrog</w:t>
+      </w:r>
+      <w:r>
+        <w:rPr>
+          <w:sz w:val="18"/>
+          <w:szCs w:val="18"/>
+        </w:rPr>
+        <w:t>a</w:t>
+      </w:r>
+      <w:r>
+        <w:rPr>
+          <w:sz w:val="18"/>
+          <w:szCs w:val="18"/>
+        </w:rPr>
+        <w:t xml:space="preserve"> w zasięgu wręcz musi</w:t>
+      </w:r>
+      <w:r>
+        <w:rPr>
+          <w:sz w:val="18"/>
+          <w:szCs w:val="18"/>
+        </w:rPr>
+        <w:t>sz</w:t>
+      </w:r>
+      <w:r>
+        <w:rPr>
+          <w:sz w:val="18"/>
+          <w:szCs w:val="18"/>
+        </w:rPr>
+        <w:t xml:space="preserve"> </w:t>
+      </w:r>
+      <w:r>
+        <w:rPr>
+          <w:sz w:val="18"/>
+          <w:szCs w:val="18"/>
+        </w:rPr>
+        <w:t xml:space="preserve">go </w:t>
+      </w:r>
+      <w:r>
+        <w:rPr>
+          <w:sz w:val="18"/>
+          <w:szCs w:val="18"/>
+        </w:rPr>
+        <w:t>wybrać</w:t>
+      </w:r>
+      <w:r>
+        <w:rPr>
+          <w:sz w:val="18"/>
+          <w:szCs w:val="18"/>
+        </w:rPr>
+        <w:t xml:space="preserve">. </w:t>
+      </w:r>
+      <w:r>
+        <w:rPr>
+          <w:sz w:val="18"/>
+          <w:szCs w:val="18"/>
+        </w:rPr>
+        <w:t>W zależności od o</w:t>
+      </w:r>
+      <w:r>
+        <w:rPr>
+          <w:sz w:val="18"/>
+          <w:szCs w:val="18"/>
+        </w:rPr>
+        <w:t>dległości od celu wybierz odpowiedni profil i te</w:t>
+      </w:r>
+      <w:r>
+        <w:rPr>
+          <w:sz w:val="18"/>
+          <w:szCs w:val="18"/>
+        </w:rPr>
+        <w:t>stuj je</w:t>
+      </w:r>
+      <w:r>
+        <w:rPr>
+          <w:sz w:val="18"/>
+          <w:szCs w:val="18"/>
+        </w:rPr>
+        <w:t>go</w:t>
+      </w:r>
+      <w:r>
+        <w:rPr>
+          <w:sz w:val="18"/>
+          <w:szCs w:val="18"/>
+        </w:rPr>
+        <w:t xml:space="preserve"> siłę przeciw </w:t>
+      </w:r>
+      <w:r>
+        <w:rPr>
+          <w:sz w:val="18"/>
+          <w:szCs w:val="18"/>
+        </w:rPr>
+        <w:t>zbroi</w:t>
+      </w:r>
+      <w:r>
+        <w:rPr>
+          <w:sz w:val="18"/>
+          <w:szCs w:val="18"/>
+        </w:rPr>
+        <w:t xml:space="preserve"> celu</w:t>
+      </w:r>
+      <w:r>
+        <w:rPr>
+          <w:sz w:val="18"/>
+          <w:szCs w:val="18"/>
+        </w:rPr>
+        <w:t xml:space="preserve"> tyle razy ile ma kości ataku</w:t>
       </w:r>
       <w:r>
         <w:rPr>
@@ -1230,7 +1563,847 @@
           <w:sz w:val="18"/>
           <w:szCs w:val="18"/>
         </w:rPr>
-        <w:t xml:space="preserve"> Nie można wykonać jeżeli </w:t>
+        <w:t xml:space="preserve"> Za każdy sukces oddział otrzymuje ran</w:t>
+      </w:r>
+      <w:r>
+        <w:rPr>
+          <w:sz w:val="18"/>
+          <w:szCs w:val="18"/>
+        </w:rPr>
+        <w:t xml:space="preserve">ę. </w:t>
+      </w:r>
+      <w:r>
+        <w:rPr>
+          <w:sz w:val="18"/>
+          <w:szCs w:val="18"/>
+        </w:rPr>
+        <w:t xml:space="preserve">Obrońca decyduje czy przyjmuje znacznik aktywacji, czy ranę za każdy </w:t>
+      </w:r>
+      <w:r>
+        <w:rPr>
+          <w:sz w:val="18"/>
+          <w:szCs w:val="18"/>
+        </w:rPr>
+        <w:t>remis</w:t>
+      </w:r>
+      <w:r>
+        <w:rPr>
+          <w:sz w:val="18"/>
+          <w:szCs w:val="18"/>
+        </w:rPr>
+        <w:t>;</w:t>
+      </w:r>
+      <w:r>
+        <w:rPr>
+          <w:sz w:val="18"/>
+          <w:szCs w:val="18"/>
+        </w:rPr>
+        <w:t xml:space="preserve"> a potem</w:t>
+      </w:r>
+      <w:r>
+        <w:rPr>
+          <w:sz w:val="18"/>
+          <w:szCs w:val="18"/>
+        </w:rPr>
+        <w:t>,</w:t>
+      </w:r>
+      <w:r>
+        <w:rPr>
+          <w:sz w:val="18"/>
+          <w:szCs w:val="18"/>
+        </w:rPr>
+        <w:t xml:space="preserve"> jeżeli</w:t>
+      </w:r>
+      <w:r>
+        <w:rPr>
+          <w:sz w:val="18"/>
+          <w:szCs w:val="18"/>
+        </w:rPr>
+        <w:t xml:space="preserve"> </w:t>
+      </w:r>
+      <w:r>
+        <w:rPr>
+          <w:sz w:val="18"/>
+          <w:szCs w:val="18"/>
+        </w:rPr>
+        <w:t xml:space="preserve">jest wręcz i nie </w:t>
+      </w:r>
+      <w:r>
+        <w:rPr>
+          <w:sz w:val="18"/>
+          <w:szCs w:val="18"/>
+        </w:rPr>
+        <w:t xml:space="preserve">ma znacznika </w:t>
+      </w:r>
+      <w:r>
+        <w:rPr>
+          <w:sz w:val="18"/>
+          <w:szCs w:val="18"/>
+        </w:rPr>
+        <w:t>aktywa</w:t>
+      </w:r>
+      <w:r>
+        <w:rPr>
+          <w:sz w:val="18"/>
+          <w:szCs w:val="18"/>
+        </w:rPr>
+        <w:t>cji</w:t>
+      </w:r>
+      <w:r>
+        <w:rPr>
+          <w:sz w:val="18"/>
+          <w:szCs w:val="18"/>
+        </w:rPr>
+        <w:t>, może</w:t>
+      </w:r>
+      <w:r>
+        <w:rPr>
+          <w:sz w:val="18"/>
+          <w:szCs w:val="18"/>
+        </w:rPr>
+        <w:t xml:space="preserve"> go</w:t>
+      </w:r>
+      <w:r>
+        <w:rPr>
+          <w:sz w:val="18"/>
+          <w:szCs w:val="18"/>
+        </w:rPr>
+        <w:t xml:space="preserve"> </w:t>
+      </w:r>
+      <w:r>
+        <w:rPr>
+          <w:sz w:val="18"/>
+          <w:szCs w:val="18"/>
+        </w:rPr>
+        <w:t>wziąć i cię zaatakować.</w:t>
+      </w:r>
+    </w:p>
+    <w:p>
+      <w:pPr>
+        <w:spacing w:after="0"/>
+        <w:rPr>
+          <w:sz w:val="18"/>
+          <w:szCs w:val="18"/>
+        </w:rPr>
+      </w:pPr>
+      <w:r>
+        <w:rPr>
+          <w:b/>
+          <w:bCs/>
+          <w:sz w:val="18"/>
+          <w:szCs w:val="18"/>
+        </w:rPr>
+        <w:t>Osłona:</w:t>
+      </w:r>
+      <w:r>
+        <w:rPr>
+          <w:b/>
+          <w:bCs/>
+          <w:sz w:val="18"/>
+          <w:szCs w:val="18"/>
+        </w:rPr>
+        <w:t xml:space="preserve"> </w:t>
+      </w:r>
+      <w:r>
+        <w:rPr>
+          <w:sz w:val="18"/>
+          <w:szCs w:val="18"/>
+        </w:rPr>
+        <w:t>Jeżeli model w atakowanym oddziale nie jest w pełni widoczny ma osłonę.</w:t>
+      </w:r>
+      <w:r>
+        <w:rPr>
+          <w:sz w:val="18"/>
+          <w:szCs w:val="18"/>
+        </w:rPr>
+        <w:t xml:space="preserve"> Jeżeli większość modeli w atakowanym oddziale ma osłonę, </w:t>
+      </w:r>
+      <w:r>
+        <w:rPr>
+          <w:sz w:val="18"/>
+          <w:szCs w:val="18"/>
+        </w:rPr>
+        <w:t>to</w:t>
+      </w:r>
+      <w:r>
+        <w:rPr>
+          <w:sz w:val="18"/>
+          <w:szCs w:val="18"/>
+        </w:rPr>
+        <w:t xml:space="preserve"> otrzymuje</w:t>
+      </w:r>
+      <w:r>
+        <w:rPr>
+          <w:sz w:val="18"/>
+          <w:szCs w:val="18"/>
+        </w:rPr>
+        <w:t>ą</w:t>
+      </w:r>
+      <w:r>
+        <w:rPr>
+          <w:sz w:val="18"/>
+          <w:szCs w:val="18"/>
+        </w:rPr>
+        <w:t xml:space="preserve">+1 do </w:t>
+      </w:r>
+      <w:r>
+        <w:rPr>
+          <w:sz w:val="18"/>
+          <w:szCs w:val="18"/>
+        </w:rPr>
+        <w:t>Zbroi</w:t>
+      </w:r>
+      <w:r>
+        <w:rPr>
+          <w:sz w:val="18"/>
+          <w:szCs w:val="18"/>
+        </w:rPr>
+        <w:t>.</w:t>
+      </w:r>
+    </w:p>
+    <w:p>
+      <w:pPr>
+        <w:spacing w:after="0"/>
+        <w:rPr>
+          <w:sz w:val="18"/>
+          <w:szCs w:val="18"/>
+        </w:rPr>
+      </w:pPr>
+    </w:p>
+    <w:p>
+      <w:pPr>
+        <w:spacing w:after="0"/>
+        <w:rPr>
+          <w:sz w:val="18"/>
+          <w:szCs w:val="18"/>
+        </w:rPr>
+      </w:pPr>
+      <w:r>
+        <w:rPr>
+          <w:b/>
+          <w:bCs/>
+          <w:sz w:val="18"/>
+          <w:szCs w:val="18"/>
+        </w:rPr>
+        <w:t>Zdolności pasywne:</w:t>
+      </w:r>
+      <w:r>
+        <w:rPr>
+          <w:sz w:val="18"/>
+          <w:szCs w:val="18"/>
+        </w:rPr>
+        <w:t xml:space="preserve"> działają stale.</w:t>
+      </w:r>
+    </w:p>
+    <w:p>
+      <w:pPr>
+        <w:spacing w:after="0"/>
+        <w:rPr>
+          <w:sz w:val="18"/>
+          <w:szCs w:val="18"/>
+        </w:rPr>
+      </w:pPr>
+      <w:r>
+        <w:rPr>
+          <w:b/>
+          <w:bCs/>
+          <w:sz w:val="18"/>
+          <w:szCs w:val="18"/>
+        </w:rPr>
+        <w:t>Bohater:</w:t>
+      </w:r>
+      <w:r>
+        <w:rPr>
+          <w:sz w:val="18"/>
+          <w:szCs w:val="18"/>
+        </w:rPr>
+        <w:t xml:space="preserve"> </w:t>
+      </w:r>
+      <w:r>
+        <w:rPr>
+          <w:sz w:val="18"/>
+          <w:szCs w:val="18"/>
+        </w:rPr>
+        <w:t>Może być zaatakowany tylko, jeżeli atakujący nie może zaatakować innego celu, albo sam jest bohaterem.</w:t>
+      </w:r>
+    </w:p>
+    <w:p>
+      <w:pPr>
+        <w:spacing w:after="0"/>
+        <w:rPr>
+          <w:sz w:val="18"/>
+          <w:szCs w:val="18"/>
+        </w:rPr>
+      </w:pPr>
+      <w:r>
+        <w:rPr>
+          <w:b/>
+          <w:bCs/>
+          <w:sz w:val="18"/>
+          <w:szCs w:val="18"/>
+        </w:rPr>
+        <w:t>Zasadzka:</w:t>
+      </w:r>
+      <w:r>
+        <w:rPr>
+          <w:sz w:val="18"/>
+          <w:szCs w:val="18"/>
+        </w:rPr>
+        <w:t xml:space="preserve"> </w:t>
+      </w:r>
+      <w:r>
+        <w:rPr>
+          <w:sz w:val="18"/>
+          <w:szCs w:val="18"/>
+        </w:rPr>
+        <w:t xml:space="preserve">Nie rozstawia się przed </w:t>
+      </w:r>
+      <w:r>
+        <w:rPr>
+          <w:sz w:val="18"/>
+          <w:szCs w:val="18"/>
+        </w:rPr>
+        <w:t>grą.</w:t>
+      </w:r>
+      <w:r>
+        <w:rPr>
+          <w:sz w:val="18"/>
+          <w:szCs w:val="18"/>
+        </w:rPr>
+        <w:t xml:space="preserve"> </w:t>
+      </w:r>
+      <w:r>
+        <w:rPr>
+          <w:sz w:val="18"/>
+          <w:szCs w:val="18"/>
+        </w:rPr>
+        <w:t xml:space="preserve">Podczas pierwszej rundy, zamiast normalnej aktywacji </w:t>
+      </w:r>
+      <w:r>
+        <w:rPr>
+          <w:sz w:val="18"/>
+          <w:szCs w:val="18"/>
+        </w:rPr>
+        <w:t>rozstaw</w:t>
+      </w:r>
+      <w:r>
+        <w:rPr>
+          <w:sz w:val="18"/>
+          <w:szCs w:val="18"/>
+        </w:rPr>
+        <w:t xml:space="preserve"> w</w:t>
+      </w:r>
+      <w:r>
+        <w:rPr>
+          <w:sz w:val="18"/>
+          <w:szCs w:val="18"/>
+        </w:rPr>
+        <w:t xml:space="preserve"> dowolnym miejscu</w:t>
+      </w:r>
+      <w:r>
+        <w:rPr>
+          <w:sz w:val="18"/>
+          <w:szCs w:val="18"/>
+        </w:rPr>
+        <w:t xml:space="preserve"> </w:t>
+      </w:r>
+      <w:r>
+        <w:rPr>
+          <w:sz w:val="18"/>
+          <w:szCs w:val="18"/>
+        </w:rPr>
+        <w:t>dalej niż wręcz</w:t>
+      </w:r>
+      <w:r>
+        <w:rPr>
+          <w:sz w:val="18"/>
+          <w:szCs w:val="18"/>
+        </w:rPr>
+        <w:t xml:space="preserve"> od wroga</w:t>
+      </w:r>
+      <w:r>
+        <w:rPr>
+          <w:sz w:val="18"/>
+          <w:szCs w:val="18"/>
+        </w:rPr>
+        <w:t>.</w:t>
+      </w:r>
+    </w:p>
+    <w:p>
+      <w:pPr>
+        <w:spacing w:after="0"/>
+        <w:rPr>
+          <w:sz w:val="18"/>
+          <w:szCs w:val="18"/>
+        </w:rPr>
+      </w:pPr>
+      <w:r>
+        <w:rPr>
+          <w:b/>
+          <w:bCs/>
+          <w:sz w:val="18"/>
+          <w:szCs w:val="18"/>
+        </w:rPr>
+        <w:t>Zwiadowca:</w:t>
+      </w:r>
+      <w:r>
+        <w:rPr>
+          <w:sz w:val="18"/>
+          <w:szCs w:val="18"/>
+        </w:rPr>
+        <w:t xml:space="preserve"> </w:t>
+      </w:r>
+      <w:r>
+        <w:rPr>
+          <w:sz w:val="18"/>
+          <w:szCs w:val="18"/>
+        </w:rPr>
+        <w:t xml:space="preserve">Po </w:t>
+      </w:r>
+      <w:r>
+        <w:rPr>
+          <w:sz w:val="18"/>
+          <w:szCs w:val="18"/>
+        </w:rPr>
+        <w:t xml:space="preserve">rozstawieniu przesuń </w:t>
+      </w:r>
+      <w:r>
+        <w:rPr>
+          <w:sz w:val="18"/>
+          <w:szCs w:val="18"/>
+        </w:rPr>
+        <w:t>go o miarkę.</w:t>
+      </w:r>
+    </w:p>
+    <w:p>
+      <w:pPr>
+        <w:spacing w:after="0"/>
+        <w:rPr>
+          <w:sz w:val="18"/>
+          <w:szCs w:val="18"/>
+        </w:rPr>
+      </w:pPr>
+      <w:r>
+        <w:rPr>
+          <w:b/>
+          <w:bCs/>
+          <w:sz w:val="18"/>
+          <w:szCs w:val="18"/>
+        </w:rPr>
+        <w:t>Zwinny:</w:t>
+      </w:r>
+      <w:r>
+        <w:rPr>
+          <w:sz w:val="18"/>
+          <w:szCs w:val="18"/>
+        </w:rPr>
+        <w:t xml:space="preserve"> Może się ruszać nawet gdy ma wroga wręcz.</w:t>
+      </w:r>
+    </w:p>
+    <w:p>
+      <w:pPr>
+        <w:spacing w:after="0"/>
+        <w:rPr>
+          <w:sz w:val="18"/>
+          <w:szCs w:val="18"/>
+        </w:rPr>
+      </w:pPr>
+      <w:r>
+        <w:rPr>
+          <w:b/>
+          <w:bCs/>
+          <w:sz w:val="18"/>
+          <w:szCs w:val="18"/>
+        </w:rPr>
+        <w:t>Szybki</w:t>
+      </w:r>
+      <w:r>
+        <w:rPr>
+          <w:b/>
+          <w:bCs/>
+          <w:sz w:val="18"/>
+          <w:szCs w:val="18"/>
+        </w:rPr>
+        <w:t>:</w:t>
+      </w:r>
+      <w:r>
+        <w:rPr>
+          <w:sz w:val="18"/>
+          <w:szCs w:val="18"/>
+        </w:rPr>
+        <w:t xml:space="preserve"> Zamiast atakować może wykonać dodatkowy ruch</w:t>
+      </w:r>
+      <w:r>
+        <w:rPr>
+          <w:sz w:val="18"/>
+          <w:szCs w:val="18"/>
+        </w:rPr>
+        <w:t>, ale nie może nim przejąć celu</w:t>
+      </w:r>
+      <w:r>
+        <w:rPr>
+          <w:sz w:val="18"/>
+          <w:szCs w:val="18"/>
+        </w:rPr>
+        <w:t>.</w:t>
+      </w:r>
+    </w:p>
+    <w:p>
+      <w:pPr>
+        <w:spacing w:after="0"/>
+        <w:rPr>
+          <w:sz w:val="18"/>
+          <w:szCs w:val="18"/>
+        </w:rPr>
+      </w:pPr>
+      <w:r>
+        <w:rPr>
+          <w:b/>
+          <w:bCs/>
+          <w:sz w:val="18"/>
+          <w:szCs w:val="18"/>
+        </w:rPr>
+        <w:t xml:space="preserve">Nieruchomy: </w:t>
+      </w:r>
+      <w:r>
+        <w:rPr>
+          <w:sz w:val="18"/>
+          <w:szCs w:val="18"/>
+        </w:rPr>
+        <w:t>Nie może się ruszać.</w:t>
+      </w:r>
+    </w:p>
+    <w:p>
+      <w:pPr>
+        <w:spacing w:after="0"/>
+        <w:rPr>
+          <w:sz w:val="18"/>
+          <w:szCs w:val="18"/>
+        </w:rPr>
+      </w:pPr>
+      <w:r>
+        <w:rPr>
+          <w:b/>
+          <w:bCs/>
+          <w:sz w:val="18"/>
+          <w:szCs w:val="18"/>
+        </w:rPr>
+        <w:t>Niezgrabny:</w:t>
+      </w:r>
+      <w:r>
+        <w:rPr>
+          <w:sz w:val="18"/>
+          <w:szCs w:val="18"/>
+        </w:rPr>
+        <w:t xml:space="preserve"> Nie może wchodzić na Wysoki teren</w:t>
+      </w:r>
+      <w:r>
+        <w:rPr>
+          <w:sz w:val="18"/>
+          <w:szCs w:val="18"/>
+        </w:rPr>
+        <w:t>.</w:t>
+      </w:r>
+    </w:p>
+    <w:p>
+      <w:pPr>
+        <w:spacing w:after="0"/>
+        <w:rPr>
+          <w:sz w:val="18"/>
+          <w:szCs w:val="18"/>
+        </w:rPr>
+      </w:pPr>
+      <w:r>
+        <w:rPr>
+          <w:b/>
+          <w:bCs/>
+          <w:sz w:val="18"/>
+          <w:szCs w:val="18"/>
+        </w:rPr>
+        <w:t>Skok</w:t>
+      </w:r>
+      <w:r>
+        <w:rPr>
+          <w:b/>
+          <w:bCs/>
+          <w:sz w:val="18"/>
+          <w:szCs w:val="18"/>
+        </w:rPr>
+        <w:t>:</w:t>
+      </w:r>
+      <w:r>
+        <w:rPr>
+          <w:sz w:val="18"/>
+          <w:szCs w:val="18"/>
+        </w:rPr>
+        <w:t xml:space="preserve"> Ignoruje teren i jednostki podczas ruchu.</w:t>
+      </w:r>
+      <w:r>
+        <w:rPr>
+          <w:sz w:val="18"/>
+          <w:szCs w:val="18"/>
+        </w:rPr>
+        <w:t xml:space="preserve"> </w:t>
+      </w:r>
+    </w:p>
+    <w:p>
+      <w:pPr>
+        <w:spacing w:after="0"/>
+        <w:rPr>
+          <w:sz w:val="18"/>
+          <w:szCs w:val="18"/>
+        </w:rPr>
+      </w:pPr>
+      <w:r>
+        <w:rPr>
+          <w:b/>
+          <w:bCs/>
+          <w:sz w:val="18"/>
+          <w:szCs w:val="18"/>
+        </w:rPr>
+        <w:t>Unik:</w:t>
+      </w:r>
+      <w:r>
+        <w:rPr>
+          <w:sz w:val="18"/>
+          <w:szCs w:val="18"/>
+        </w:rPr>
+        <w:t xml:space="preserve"> </w:t>
+      </w:r>
+      <w:r>
+        <w:rPr>
+          <w:sz w:val="18"/>
+          <w:szCs w:val="18"/>
+        </w:rPr>
+        <w:t xml:space="preserve">wrogowie atakujący </w:t>
+      </w:r>
+      <w:r>
+        <w:rPr>
+          <w:sz w:val="18"/>
+          <w:szCs w:val="18"/>
+        </w:rPr>
+        <w:t xml:space="preserve">cię </w:t>
+      </w:r>
+      <w:r>
+        <w:rPr>
+          <w:sz w:val="18"/>
+          <w:szCs w:val="18"/>
+        </w:rPr>
+        <w:t>nie będąc w zasięgu wręcz musza przerzucić wszystkie 6.</w:t>
+      </w:r>
+    </w:p>
+    <w:p>
+      <w:pPr>
+        <w:spacing w:after="0"/>
+        <w:rPr>
+          <w:sz w:val="18"/>
+          <w:szCs w:val="18"/>
+        </w:rPr>
+      </w:pPr>
+      <w:r>
+        <w:rPr>
+          <w:b/>
+          <w:bCs/>
+          <w:sz w:val="18"/>
+          <w:szCs w:val="18"/>
+        </w:rPr>
+        <w:t>Parowanie:</w:t>
+      </w:r>
+      <w:r>
+        <w:rPr>
+          <w:sz w:val="18"/>
+          <w:szCs w:val="18"/>
+        </w:rPr>
+        <w:t xml:space="preserve"> </w:t>
+      </w:r>
+      <w:r>
+        <w:rPr>
+          <w:sz w:val="18"/>
+          <w:szCs w:val="18"/>
+        </w:rPr>
+        <w:t xml:space="preserve">wrogowie atakujący </w:t>
+      </w:r>
+      <w:r>
+        <w:rPr>
+          <w:sz w:val="18"/>
+          <w:szCs w:val="18"/>
+        </w:rPr>
+        <w:t xml:space="preserve">cię </w:t>
+      </w:r>
+      <w:r>
+        <w:rPr>
+          <w:sz w:val="18"/>
+          <w:szCs w:val="18"/>
+        </w:rPr>
+        <w:t>będąc w zasięgu wręcz musza przerzucić wszystkie 6.</w:t>
+      </w:r>
+    </w:p>
+    <w:p>
+      <w:pPr>
+        <w:spacing w:after="0"/>
+        <w:rPr>
+          <w:sz w:val="18"/>
+          <w:szCs w:val="18"/>
+        </w:rPr>
+      </w:pPr>
+      <w:r>
+        <w:rPr>
+          <w:b/>
+          <w:bCs/>
+          <w:sz w:val="18"/>
+          <w:szCs w:val="18"/>
+        </w:rPr>
+        <w:t>Wytrwały:</w:t>
+      </w:r>
+      <w:r>
+        <w:rPr>
+          <w:sz w:val="18"/>
+          <w:szCs w:val="18"/>
+        </w:rPr>
+        <w:t xml:space="preserve">  +1 do </w:t>
+      </w:r>
+      <w:r>
+        <w:rPr>
+          <w:sz w:val="18"/>
+          <w:szCs w:val="18"/>
+        </w:rPr>
+        <w:t>Zbroi</w:t>
+      </w:r>
+      <w:r>
+        <w:rPr>
+          <w:sz w:val="18"/>
+          <w:szCs w:val="18"/>
+        </w:rPr>
+        <w:t xml:space="preserve"> za każdy</w:t>
+      </w:r>
+      <w:r>
+        <w:rPr>
+          <w:sz w:val="18"/>
+          <w:szCs w:val="18"/>
+        </w:rPr>
+        <w:t xml:space="preserve"> znacznik</w:t>
+      </w:r>
+      <w:r>
+        <w:rPr>
+          <w:sz w:val="18"/>
+          <w:szCs w:val="18"/>
+        </w:rPr>
+        <w:t xml:space="preserve"> a</w:t>
+      </w:r>
+      <w:r>
+        <w:rPr>
+          <w:sz w:val="18"/>
+          <w:szCs w:val="18"/>
+        </w:rPr>
+        <w:t>ktywacji.</w:t>
+      </w:r>
+    </w:p>
+    <w:p>
+      <w:pPr>
+        <w:spacing w:after="0"/>
+        <w:rPr>
+          <w:b/>
+          <w:bCs/>
+          <w:sz w:val="18"/>
+          <w:szCs w:val="18"/>
+        </w:rPr>
+      </w:pPr>
+      <w:r>
+        <w:rPr>
+          <w:b/>
+          <w:bCs/>
+          <w:sz w:val="18"/>
+          <w:szCs w:val="18"/>
+        </w:rPr>
+        <w:t>Cierpliwy:</w:t>
+      </w:r>
+      <w:r>
+        <w:rPr>
+          <w:sz w:val="18"/>
+          <w:szCs w:val="18"/>
+        </w:rPr>
+        <w:t xml:space="preserve"> +1 </w:t>
+      </w:r>
+      <w:r>
+        <w:rPr>
+          <w:sz w:val="18"/>
+          <w:szCs w:val="18"/>
+        </w:rPr>
+        <w:t xml:space="preserve">do </w:t>
+      </w:r>
+      <w:r>
+        <w:rPr>
+          <w:sz w:val="18"/>
+          <w:szCs w:val="18"/>
+        </w:rPr>
+        <w:t>Siły</w:t>
+      </w:r>
+      <w:r>
+        <w:rPr>
+          <w:sz w:val="18"/>
+          <w:szCs w:val="18"/>
+        </w:rPr>
+        <w:t xml:space="preserve"> za każdy znacznik aktywacji na celu</w:t>
+      </w:r>
+      <w:r>
+        <w:rPr>
+          <w:sz w:val="18"/>
+          <w:szCs w:val="18"/>
+        </w:rPr>
+        <w:t>.</w:t>
+      </w:r>
+    </w:p>
+    <w:p>
+      <w:pPr>
+        <w:spacing w:after="0"/>
+        <w:rPr>
+          <w:sz w:val="18"/>
+          <w:szCs w:val="18"/>
+        </w:rPr>
+      </w:pPr>
+      <w:r>
+        <w:rPr>
+          <w:b/>
+          <w:bCs/>
+          <w:sz w:val="18"/>
+          <w:szCs w:val="18"/>
+        </w:rPr>
+        <w:t>Przełamanie:</w:t>
+      </w:r>
+      <w:r>
+        <w:rPr>
+          <w:sz w:val="18"/>
+          <w:szCs w:val="18"/>
+        </w:rPr>
+        <w:t xml:space="preserve"> Jeżeli </w:t>
+      </w:r>
+      <w:r>
+        <w:rPr>
+          <w:sz w:val="18"/>
+          <w:szCs w:val="18"/>
+        </w:rPr>
+        <w:t xml:space="preserve">ty lub </w:t>
+      </w:r>
+      <w:r>
+        <w:rPr>
+          <w:sz w:val="18"/>
+          <w:szCs w:val="18"/>
+        </w:rPr>
+        <w:t xml:space="preserve">cel ataku </w:t>
+      </w:r>
+      <w:r>
+        <w:rPr>
+          <w:sz w:val="18"/>
+          <w:szCs w:val="18"/>
+        </w:rPr>
+        <w:t xml:space="preserve">jest </w:t>
+      </w:r>
+      <w:r>
+        <w:rPr>
+          <w:sz w:val="18"/>
+          <w:szCs w:val="18"/>
+        </w:rPr>
+        <w:t xml:space="preserve">w zasięgu </w:t>
       </w:r>
       <w:r>
         <w:rPr>
@@ -1244,6 +2417,70 @@
           <w:sz w:val="18"/>
           <w:szCs w:val="18"/>
         </w:rPr>
+        <w:t xml:space="preserve"> celu misji, </w:t>
+      </w:r>
+      <w:r>
+        <w:rPr>
+          <w:sz w:val="18"/>
+          <w:szCs w:val="18"/>
+        </w:rPr>
+        <w:t>możesz przerzucić wszystkie 1.</w:t>
+      </w:r>
+    </w:p>
+    <w:p>
+      <w:pPr>
+        <w:spacing w:after="0"/>
+        <w:rPr>
+          <w:sz w:val="18"/>
+          <w:szCs w:val="18"/>
+        </w:rPr>
+      </w:pPr>
+      <w:r>
+        <w:rPr>
+          <w:b/>
+          <w:bCs/>
+          <w:sz w:val="18"/>
+          <w:szCs w:val="18"/>
+        </w:rPr>
+        <w:t>Kontratak:</w:t>
+      </w:r>
+      <w:r>
+        <w:rPr>
+          <w:sz w:val="18"/>
+          <w:szCs w:val="18"/>
+        </w:rPr>
+        <w:t xml:space="preserve"> Atakujący wręcz</w:t>
+      </w:r>
+      <w:r>
+        <w:rPr>
+          <w:sz w:val="18"/>
+          <w:szCs w:val="18"/>
+        </w:rPr>
+        <w:t xml:space="preserve"> otrzymuje 1 ranę za każdą porażkę.</w:t>
+      </w:r>
+    </w:p>
+    <w:p>
+      <w:pPr>
+        <w:spacing w:after="0"/>
+        <w:rPr>
+          <w:sz w:val="18"/>
+          <w:szCs w:val="18"/>
+        </w:rPr>
+      </w:pPr>
+      <w:r>
+        <w:rPr>
+          <w:b/>
+          <w:bCs/>
+          <w:sz w:val="18"/>
+          <w:szCs w:val="18"/>
+        </w:rPr>
+        <w:t>Samolot:</w:t>
+      </w:r>
+      <w:r>
+        <w:rPr>
+          <w:sz w:val="18"/>
+          <w:szCs w:val="18"/>
+        </w:rPr>
         <w:t xml:space="preserve"> </w:t>
       </w:r>
       <w:r>
@@ -1251,7 +2488,57 @@
           <w:sz w:val="18"/>
           <w:szCs w:val="18"/>
         </w:rPr>
-        <w:t>wroga</w:t>
+        <w:t>Ma nieograniczony ruch</w:t>
+      </w:r>
+      <w:r>
+        <w:rPr>
+          <w:sz w:val="18"/>
+          <w:szCs w:val="18"/>
+        </w:rPr>
+        <w:t xml:space="preserve">, jest w dalekim zasięgu od wszystkiego, można przez niego patrzeć i </w:t>
+      </w:r>
+      <w:r>
+        <w:rPr>
+          <w:sz w:val="18"/>
+          <w:szCs w:val="18"/>
+        </w:rPr>
+        <w:t>przemieszczać się.</w:t>
+      </w:r>
+    </w:p>
+    <w:p>
+      <w:pPr>
+        <w:spacing w:after="0"/>
+        <w:rPr>
+          <w:sz w:val="18"/>
+          <w:szCs w:val="18"/>
+        </w:rPr>
+      </w:pPr>
+    </w:p>
+    <w:p>
+      <w:pPr>
+        <w:spacing w:after="0"/>
+        <w:rPr>
+          <w:b/>
+          <w:bCs/>
+          <w:sz w:val="18"/>
+          <w:szCs w:val="18"/>
+        </w:rPr>
+      </w:pPr>
+      <w:r>
+        <w:rPr>
+          <w:b/>
+          <w:bCs/>
+          <w:sz w:val="18"/>
+          <w:szCs w:val="18"/>
+        </w:rPr>
+        <w:t>Zdolności specjalne:</w:t>
+      </w:r>
+      <w:r>
+        <w:rPr>
+          <w:sz w:val="18"/>
+          <w:szCs w:val="18"/>
+        </w:rPr>
+        <w:t xml:space="preserve"> gracz decyduje o ich wykorzystaniu</w:t>
       </w:r>
       <w:r>
         <w:rPr>
@@ -1260,23 +2547,30 @@
         </w:rPr>
         <w:t>.</w:t>
       </w:r>
-    </w:p>
-    <w:p>
-      <w:pPr>
-        <w:spacing w:after="0"/>
-        <w:rPr>
-          <w:sz w:val="18"/>
-          <w:szCs w:val="18"/>
-        </w:rPr>
-      </w:pPr>
-      <w:r>
-        <w:rPr>
-          <w:b/>
-          <w:bCs/>
-          <w:sz w:val="18"/>
-          <w:szCs w:val="18"/>
-        </w:rPr>
-        <w:t>Atak:</w:t>
+      <w:r>
+        <w:rPr>
+          <w:sz w:val="18"/>
+          <w:szCs w:val="18"/>
+        </w:rPr>
+        <w:t xml:space="preserve"> Są przypisane do oddziału.</w:t>
+      </w:r>
+    </w:p>
+    <w:p>
+      <w:pPr>
+        <w:spacing w:after="0"/>
+        <w:rPr>
+          <w:sz w:val="18"/>
+          <w:szCs w:val="18"/>
+        </w:rPr>
+      </w:pPr>
+      <w:r>
+        <w:rPr>
+          <w:b/>
+          <w:bCs/>
+          <w:sz w:val="18"/>
+          <w:szCs w:val="18"/>
+        </w:rPr>
+        <w:t>Łatanie:</w:t>
       </w:r>
       <w:r>
         <w:rPr>
@@ -1290,63 +2584,14 @@
           <w:sz w:val="18"/>
           <w:szCs w:val="18"/>
         </w:rPr>
-        <w:t xml:space="preserve">Wybierz </w:t>
-      </w:r>
-      <w:r>
-        <w:rPr>
-          <w:sz w:val="18"/>
-          <w:szCs w:val="18"/>
-        </w:rPr>
-        <w:t>widoczny wrogi oddział</w:t>
-      </w:r>
-      <w:r>
-        <w:rPr>
-          <w:sz w:val="18"/>
-          <w:szCs w:val="18"/>
-        </w:rPr>
-        <w:t>, j</w:t>
-      </w:r>
-      <w:r>
-        <w:rPr>
-          <w:sz w:val="18"/>
-          <w:szCs w:val="18"/>
-        </w:rPr>
-        <w:t xml:space="preserve">eżeli </w:t>
-      </w:r>
-      <w:r>
-        <w:rPr>
-          <w:sz w:val="18"/>
-          <w:szCs w:val="18"/>
-        </w:rPr>
-        <w:t>masz</w:t>
-      </w:r>
-      <w:r>
-        <w:rPr>
-          <w:sz w:val="18"/>
-          <w:szCs w:val="18"/>
-        </w:rPr>
-        <w:t xml:space="preserve"> wrog</w:t>
-      </w:r>
-      <w:r>
-        <w:rPr>
-          <w:sz w:val="18"/>
-          <w:szCs w:val="18"/>
-        </w:rPr>
-        <w:t>a</w:t>
-      </w:r>
-      <w:r>
-        <w:rPr>
-          <w:sz w:val="18"/>
-          <w:szCs w:val="18"/>
-        </w:rPr>
-        <w:t xml:space="preserve"> w zasięgu wręcz musi</w:t>
-      </w:r>
-      <w:r>
-        <w:rPr>
-          <w:sz w:val="18"/>
-          <w:szCs w:val="18"/>
-        </w:rPr>
-        <w:t>sz</w:t>
+        <w:t xml:space="preserve">Na koniec aktywacji </w:t>
+      </w:r>
+      <w:r>
+        <w:rPr>
+          <w:sz w:val="18"/>
+          <w:szCs w:val="18"/>
+        </w:rPr>
+        <w:t>ten</w:t>
       </w:r>
       <w:r>
         <w:rPr>
@@ -1360,84 +2605,42 @@
           <w:sz w:val="18"/>
           <w:szCs w:val="18"/>
         </w:rPr>
-        <w:t xml:space="preserve">go </w:t>
-      </w:r>
-      <w:r>
-        <w:rPr>
-          <w:sz w:val="18"/>
-          <w:szCs w:val="18"/>
-        </w:rPr>
-        <w:t xml:space="preserve">wybrać </w:t>
-      </w:r>
-      <w:r>
-        <w:rPr>
-          <w:sz w:val="18"/>
-          <w:szCs w:val="18"/>
-        </w:rPr>
-        <w:t>g</w:t>
-      </w:r>
-      <w:r>
-        <w:rPr>
-          <w:sz w:val="18"/>
-          <w:szCs w:val="18"/>
-        </w:rPr>
-        <w:t>o</w:t>
-      </w:r>
-      <w:r>
-        <w:rPr>
-          <w:sz w:val="18"/>
-          <w:szCs w:val="18"/>
-        </w:rPr>
-        <w:t xml:space="preserve">. </w:t>
-      </w:r>
-      <w:r>
-        <w:rPr>
-          <w:sz w:val="18"/>
-          <w:szCs w:val="18"/>
-        </w:rPr>
-        <w:t>W zależności od o</w:t>
-      </w:r>
-      <w:r>
-        <w:rPr>
-          <w:sz w:val="18"/>
-          <w:szCs w:val="18"/>
-        </w:rPr>
-        <w:t>dległości od celu wybierz odpowiedni profil i te</w:t>
-      </w:r>
-      <w:r>
-        <w:rPr>
-          <w:sz w:val="18"/>
-          <w:szCs w:val="18"/>
-        </w:rPr>
-        <w:t>stuj je</w:t>
-      </w:r>
-      <w:r>
-        <w:rPr>
-          <w:sz w:val="18"/>
-          <w:szCs w:val="18"/>
-        </w:rPr>
-        <w:t>go</w:t>
-      </w:r>
-      <w:r>
-        <w:rPr>
-          <w:sz w:val="18"/>
-          <w:szCs w:val="18"/>
-        </w:rPr>
-        <w:t xml:space="preserve"> siłę przeciw </w:t>
-      </w:r>
-      <w:r>
-        <w:rPr>
-          <w:sz w:val="18"/>
-          <w:szCs w:val="18"/>
-        </w:rPr>
-        <w:t>obronie celu</w:t>
-      </w:r>
-      <w:r>
-        <w:rPr>
-          <w:sz w:val="18"/>
-          <w:szCs w:val="18"/>
-        </w:rPr>
-        <w:t xml:space="preserve"> tyle razy ile ma kości ataku</w:t>
+        <w:t xml:space="preserve">oddział </w:t>
+      </w:r>
+      <w:r>
+        <w:rPr>
+          <w:sz w:val="18"/>
+          <w:szCs w:val="18"/>
+        </w:rPr>
+        <w:t xml:space="preserve">lub inny </w:t>
+      </w:r>
+      <w:r>
+        <w:rPr>
+          <w:sz w:val="18"/>
+          <w:szCs w:val="18"/>
+        </w:rPr>
+        <w:t xml:space="preserve">w </w:t>
+      </w:r>
+      <w:r>
+        <w:rPr>
+          <w:sz w:val="18"/>
+          <w:szCs w:val="18"/>
+        </w:rPr>
+        <w:t xml:space="preserve">zasięgu </w:t>
+      </w:r>
+      <w:r>
+        <w:rPr>
+          <w:sz w:val="18"/>
+          <w:szCs w:val="18"/>
+        </w:rPr>
+        <w:t xml:space="preserve">wręcz </w:t>
+      </w:r>
+      <w:r>
+        <w:rPr>
+          <w:sz w:val="18"/>
+          <w:szCs w:val="18"/>
+        </w:rPr>
+        <w:t>leczy ranę</w:t>
       </w:r>
       <w:r>
         <w:rPr>
@@ -1446,63 +2649,102 @@
         </w:rPr>
         <w:t>.</w:t>
       </w:r>
-      <w:r>
-        <w:rPr>
-          <w:sz w:val="18"/>
-          <w:szCs w:val="18"/>
-        </w:rPr>
-        <w:t xml:space="preserve"> Za każdy sukces </w:t>
-      </w:r>
-      <w:r>
-        <w:rPr>
-          <w:sz w:val="18"/>
-          <w:szCs w:val="18"/>
-        </w:rPr>
-        <w:t>oddział otrzymuje ran</w:t>
-      </w:r>
-      <w:r>
-        <w:rPr>
-          <w:sz w:val="18"/>
-          <w:szCs w:val="18"/>
-        </w:rPr>
-        <w:t xml:space="preserve">ę. </w:t>
-      </w:r>
-      <w:r>
-        <w:rPr>
-          <w:sz w:val="18"/>
-          <w:szCs w:val="18"/>
-        </w:rPr>
-        <w:t xml:space="preserve">Obrońca decyduje czy przyjmuje znacznik aktywacji, czy ranę za każdy </w:t>
-      </w:r>
-      <w:r>
-        <w:rPr>
-          <w:sz w:val="18"/>
-          <w:szCs w:val="18"/>
-        </w:rPr>
-        <w:t>remis.</w:t>
-      </w:r>
-    </w:p>
-    <w:p>
-      <w:pPr>
-        <w:spacing w:after="0"/>
-        <w:rPr>
-          <w:sz w:val="18"/>
-          <w:szCs w:val="18"/>
-        </w:rPr>
-      </w:pPr>
-      <w:r>
-        <w:rPr>
-          <w:b/>
-          <w:bCs/>
-          <w:sz w:val="18"/>
-          <w:szCs w:val="18"/>
-        </w:rPr>
-        <w:t>Osłona:</w:t>
-      </w:r>
-      <w:r>
-        <w:rPr>
-          <w:b/>
-          <w:bCs/>
+    </w:p>
+    <w:p>
+      <w:pPr>
+        <w:spacing w:after="0"/>
+        <w:rPr>
+          <w:sz w:val="18"/>
+          <w:szCs w:val="18"/>
+        </w:rPr>
+      </w:pPr>
+      <w:r>
+        <w:rPr>
+          <w:b/>
+          <w:bCs/>
+          <w:sz w:val="18"/>
+          <w:szCs w:val="18"/>
+        </w:rPr>
+        <w:t xml:space="preserve">Aura (X): </w:t>
+      </w:r>
+      <w:r>
+        <w:rPr>
+          <w:sz w:val="18"/>
+          <w:szCs w:val="18"/>
+        </w:rPr>
+        <w:t>Przyjazne</w:t>
+      </w:r>
+      <w:r>
+        <w:rPr>
+          <w:sz w:val="18"/>
+          <w:szCs w:val="18"/>
+        </w:rPr>
+        <w:t xml:space="preserve"> oddziały</w:t>
+      </w:r>
+      <w:r>
+        <w:rPr>
+          <w:sz w:val="18"/>
+          <w:szCs w:val="18"/>
+        </w:rPr>
+        <w:t xml:space="preserve"> w zasięgu jednej</w:t>
+      </w:r>
+      <w:r>
+        <w:rPr>
+          <w:sz w:val="18"/>
+          <w:szCs w:val="18"/>
+        </w:rPr>
+        <w:t xml:space="preserve">, lub </w:t>
+      </w:r>
+      <w:r>
+        <w:rPr>
+          <w:sz w:val="18"/>
+          <w:szCs w:val="18"/>
+        </w:rPr>
+        <w:t>ich profile ataku,</w:t>
+      </w:r>
+      <w:r>
+        <w:rPr>
+          <w:sz w:val="18"/>
+          <w:szCs w:val="18"/>
+        </w:rPr>
+        <w:t xml:space="preserve"> miarki mają zdolność X</w:t>
+      </w:r>
+      <w:r>
+        <w:rPr>
+          <w:sz w:val="18"/>
+          <w:szCs w:val="18"/>
+        </w:rPr>
+        <w:t>.</w:t>
+      </w:r>
+    </w:p>
+    <w:p>
+      <w:pPr>
+        <w:spacing w:after="0"/>
+        <w:rPr>
+          <w:sz w:val="18"/>
+          <w:szCs w:val="18"/>
+        </w:rPr>
+      </w:pPr>
+      <w:r>
+        <w:rPr>
+          <w:b/>
+          <w:bCs/>
+          <w:sz w:val="18"/>
+          <w:szCs w:val="18"/>
+        </w:rPr>
+        <w:t>Rozkaz</w:t>
+      </w:r>
+      <w:r>
+        <w:rPr>
+          <w:b/>
+          <w:bCs/>
+          <w:sz w:val="18"/>
+          <w:szCs w:val="18"/>
+        </w:rPr>
+        <w:t>:</w:t>
+      </w:r>
+      <w:r>
+        <w:rPr>
           <w:sz w:val="18"/>
           <w:szCs w:val="18"/>
         </w:rPr>
@@ -1513,94 +2755,193 @@
           <w:sz w:val="18"/>
           <w:szCs w:val="18"/>
         </w:rPr>
-        <w:t>Jeżeli model w atakowanym oddziale nie jest w pełni widoczny ma osłonę.</w:t>
-      </w:r>
-      <w:r>
-        <w:rPr>
-          <w:sz w:val="18"/>
-          <w:szCs w:val="18"/>
-        </w:rPr>
-        <w:t xml:space="preserve"> Jeżeli większość modeli w atakowanym oddziale ma osłonę, </w:t>
-      </w:r>
-      <w:r>
-        <w:rPr>
-          <w:sz w:val="18"/>
-          <w:szCs w:val="18"/>
-        </w:rPr>
-        <w:t>to</w:t>
-      </w:r>
-      <w:r>
-        <w:rPr>
-          <w:sz w:val="18"/>
-          <w:szCs w:val="18"/>
-        </w:rPr>
-        <w:t xml:space="preserve"> otrzymuje</w:t>
-      </w:r>
-      <w:r>
-        <w:rPr>
-          <w:sz w:val="18"/>
-          <w:szCs w:val="18"/>
-        </w:rPr>
-        <w:t>ą</w:t>
-      </w:r>
-      <w:r>
-        <w:rPr>
-          <w:sz w:val="18"/>
-          <w:szCs w:val="18"/>
-        </w:rPr>
-        <w:t>+1 do obrony.</w:t>
-      </w:r>
-    </w:p>
-    <w:p>
-      <w:pPr>
-        <w:spacing w:after="0"/>
-        <w:rPr>
-          <w:sz w:val="18"/>
-          <w:szCs w:val="18"/>
-        </w:rPr>
-      </w:pPr>
-    </w:p>
-    <w:p>
-      <w:pPr>
-        <w:spacing w:after="0"/>
-        <w:rPr>
-          <w:sz w:val="18"/>
-          <w:szCs w:val="18"/>
-        </w:rPr>
-      </w:pPr>
-      <w:r>
-        <w:rPr>
-          <w:b/>
-          <w:bCs/>
-          <w:sz w:val="18"/>
-          <w:szCs w:val="18"/>
-        </w:rPr>
-        <w:t>Zdolności pasywne:</w:t>
-      </w:r>
-      <w:r>
-        <w:rPr>
-          <w:sz w:val="18"/>
-          <w:szCs w:val="18"/>
-        </w:rPr>
-        <w:t xml:space="preserve"> działają stale.</w:t>
-      </w:r>
-    </w:p>
-    <w:p>
-      <w:pPr>
-        <w:spacing w:after="0"/>
-        <w:rPr>
-          <w:sz w:val="18"/>
-          <w:szCs w:val="18"/>
-        </w:rPr>
-      </w:pPr>
-      <w:r>
-        <w:rPr>
-          <w:b/>
-          <w:bCs/>
-          <w:sz w:val="18"/>
-          <w:szCs w:val="18"/>
-        </w:rPr>
-        <w:t>Bohater:</w:t>
+        <w:t>Po twojej aktywacji możesz aktywować następny oddział</w:t>
+      </w:r>
+      <w:r>
+        <w:rPr>
+          <w:sz w:val="18"/>
+          <w:szCs w:val="18"/>
+        </w:rPr>
+        <w:t xml:space="preserve"> bez tej zdolności</w:t>
+      </w:r>
+      <w:r>
+        <w:rPr>
+          <w:sz w:val="18"/>
+          <w:szCs w:val="18"/>
+        </w:rPr>
+        <w:t>, nawet jeżeli ma już znacznik aktywacji.</w:t>
+      </w:r>
+      <w:r>
+        <w:rPr>
+          <w:sz w:val="18"/>
+          <w:szCs w:val="18"/>
+        </w:rPr>
+        <w:t xml:space="preserve"> (Dostaje </w:t>
+      </w:r>
+      <w:r>
+        <w:rPr>
+          <w:sz w:val="18"/>
+          <w:szCs w:val="18"/>
+        </w:rPr>
+        <w:t>znacznik aktywacji).</w:t>
+      </w:r>
+    </w:p>
+    <w:p>
+      <w:pPr>
+        <w:spacing w:after="0"/>
+        <w:rPr>
+          <w:sz w:val="18"/>
+          <w:szCs w:val="18"/>
+        </w:rPr>
+      </w:pPr>
+      <w:r>
+        <w:rPr>
+          <w:b/>
+          <w:bCs/>
+          <w:sz w:val="18"/>
+          <w:szCs w:val="18"/>
+        </w:rPr>
+        <w:t>Transport:</w:t>
+      </w:r>
+      <w:r>
+        <w:rPr>
+          <w:sz w:val="18"/>
+          <w:szCs w:val="18"/>
+        </w:rPr>
+        <w:t xml:space="preserve"> Zanim wykona ruch </w:t>
+      </w:r>
+      <w:r>
+        <w:rPr>
+          <w:sz w:val="18"/>
+          <w:szCs w:val="18"/>
+        </w:rPr>
+        <w:t xml:space="preserve">przyjazne </w:t>
+      </w:r>
+      <w:r>
+        <w:rPr>
+          <w:sz w:val="18"/>
+          <w:szCs w:val="18"/>
+        </w:rPr>
+        <w:t xml:space="preserve">oddziały </w:t>
+      </w:r>
+      <w:r>
+        <w:rPr>
+          <w:sz w:val="18"/>
+          <w:szCs w:val="18"/>
+        </w:rPr>
+        <w:t xml:space="preserve">bez Niezgrabny </w:t>
+      </w:r>
+      <w:r>
+        <w:rPr>
+          <w:sz w:val="18"/>
+          <w:szCs w:val="18"/>
+        </w:rPr>
+        <w:t>wręcz od niego mogą zostać zdjęte z planszy i rozstawione ponownie</w:t>
+      </w:r>
+      <w:r>
+        <w:rPr>
+          <w:sz w:val="18"/>
+          <w:szCs w:val="18"/>
+        </w:rPr>
+        <w:t xml:space="preserve"> wręcz od niego</w:t>
+      </w:r>
+      <w:r>
+        <w:rPr>
+          <w:sz w:val="18"/>
+          <w:szCs w:val="18"/>
+        </w:rPr>
+        <w:t>,</w:t>
+      </w:r>
+      <w:r>
+        <w:rPr>
+          <w:sz w:val="18"/>
+          <w:szCs w:val="18"/>
+        </w:rPr>
+        <w:t xml:space="preserve"> gdy zakończy ruch</w:t>
+      </w:r>
+      <w:r>
+        <w:rPr>
+          <w:sz w:val="18"/>
+          <w:szCs w:val="18"/>
+        </w:rPr>
+        <w:t>.</w:t>
+      </w:r>
+    </w:p>
+    <w:p>
+      <w:pPr>
+        <w:spacing w:after="0"/>
+        <w:rPr>
+          <w:b/>
+          <w:bCs/>
+          <w:sz w:val="18"/>
+          <w:szCs w:val="18"/>
+        </w:rPr>
+      </w:pPr>
+    </w:p>
+    <w:p>
+      <w:pPr>
+        <w:spacing w:after="0"/>
+        <w:rPr>
+          <w:sz w:val="18"/>
+          <w:szCs w:val="18"/>
+        </w:rPr>
+      </w:pPr>
+      <w:r>
+        <w:rPr>
+          <w:b/>
+          <w:bCs/>
+          <w:sz w:val="18"/>
+          <w:szCs w:val="18"/>
+        </w:rPr>
+        <w:t xml:space="preserve">Zdolności </w:t>
+      </w:r>
+      <w:r>
+        <w:rPr>
+          <w:b/>
+          <w:bCs/>
+          <w:sz w:val="18"/>
+          <w:szCs w:val="18"/>
+        </w:rPr>
+        <w:t xml:space="preserve">ataku: </w:t>
+      </w:r>
+      <w:r>
+        <w:rPr>
+          <w:sz w:val="18"/>
+          <w:szCs w:val="18"/>
+        </w:rPr>
+        <w:t>przypisane do p</w:t>
+      </w:r>
+      <w:r>
+        <w:rPr>
+          <w:sz w:val="18"/>
+          <w:szCs w:val="18"/>
+        </w:rPr>
+        <w:t>rofilu ataku</w:t>
+      </w:r>
+      <w:r>
+        <w:rPr>
+          <w:sz w:val="18"/>
+          <w:szCs w:val="18"/>
+        </w:rPr>
+        <w:t>.</w:t>
+      </w:r>
+    </w:p>
+    <w:p>
+      <w:pPr>
+        <w:spacing w:after="0"/>
+        <w:rPr>
+          <w:sz w:val="18"/>
+          <w:szCs w:val="18"/>
+        </w:rPr>
+      </w:pPr>
+      <w:r>
+        <w:rPr>
+          <w:b/>
+          <w:bCs/>
+          <w:sz w:val="18"/>
+          <w:szCs w:val="18"/>
+        </w:rPr>
+        <w:t>Obszarowa:</w:t>
       </w:r>
       <w:r>
         <w:rPr>
@@ -1614,25 +2955,25 @@
           <w:sz w:val="18"/>
           <w:szCs w:val="18"/>
         </w:rPr>
-        <w:t>Może być zaatakowany tylko, jeżeli atakujący nie może zaatakować innego celu, albo sam jest bohaterem.</w:t>
-      </w:r>
-    </w:p>
-    <w:p>
-      <w:pPr>
-        <w:spacing w:after="0"/>
-        <w:rPr>
-          <w:sz w:val="18"/>
-          <w:szCs w:val="18"/>
-        </w:rPr>
-      </w:pPr>
-      <w:r>
-        <w:rPr>
-          <w:b/>
-          <w:bCs/>
-          <w:sz w:val="18"/>
-          <w:szCs w:val="18"/>
-        </w:rPr>
-        <w:t>Zasadzka:</w:t>
+        <w:t>Wybierz widoczny model w zasięgu. Atakujesz jego oraz wszystkie modele wręcz od niego. Kości przeciw modelom tego samego oddziału rzuć razem.</w:t>
+      </w:r>
+    </w:p>
+    <w:p>
+      <w:pPr>
+        <w:spacing w:after="0"/>
+        <w:rPr>
+          <w:sz w:val="18"/>
+          <w:szCs w:val="18"/>
+        </w:rPr>
+      </w:pPr>
+      <w:r>
+        <w:rPr>
+          <w:b/>
+          <w:bCs/>
+          <w:sz w:val="18"/>
+          <w:szCs w:val="18"/>
+        </w:rPr>
+        <w:t>Zabójczy:</w:t>
       </w:r>
       <w:r>
         <w:rPr>
@@ -1646,1153 +2987,6 @@
           <w:sz w:val="18"/>
           <w:szCs w:val="18"/>
         </w:rPr>
-        <w:t xml:space="preserve">Nie rozstawia się przed </w:t>
-      </w:r>
-      <w:r>
-        <w:rPr>
-          <w:sz w:val="18"/>
-          <w:szCs w:val="18"/>
-        </w:rPr>
-        <w:t>grą.</w:t>
-      </w:r>
-      <w:r>
-        <w:rPr>
-          <w:sz w:val="18"/>
-          <w:szCs w:val="18"/>
-        </w:rPr>
-        <w:t xml:space="preserve"> </w:t>
-      </w:r>
-      <w:r>
-        <w:rPr>
-          <w:sz w:val="18"/>
-          <w:szCs w:val="18"/>
-        </w:rPr>
-        <w:t xml:space="preserve">Podczas pierwszej rundy, zamiast normalnej aktywacji </w:t>
-      </w:r>
-      <w:r>
-        <w:rPr>
-          <w:sz w:val="18"/>
-          <w:szCs w:val="18"/>
-        </w:rPr>
-        <w:t>rozstaw</w:t>
-      </w:r>
-      <w:r>
-        <w:rPr>
-          <w:sz w:val="18"/>
-          <w:szCs w:val="18"/>
-        </w:rPr>
-        <w:t xml:space="preserve"> w</w:t>
-      </w:r>
-      <w:r>
-        <w:rPr>
-          <w:sz w:val="18"/>
-          <w:szCs w:val="18"/>
-        </w:rPr>
-        <w:t xml:space="preserve"> dowolnym miejscu</w:t>
-      </w:r>
-      <w:r>
-        <w:rPr>
-          <w:sz w:val="18"/>
-          <w:szCs w:val="18"/>
-        </w:rPr>
-        <w:t xml:space="preserve"> </w:t>
-      </w:r>
-      <w:r>
-        <w:rPr>
-          <w:sz w:val="18"/>
-          <w:szCs w:val="18"/>
-        </w:rPr>
-        <w:t>dalej niż wręcz</w:t>
-      </w:r>
-      <w:r>
-        <w:rPr>
-          <w:sz w:val="18"/>
-          <w:szCs w:val="18"/>
-        </w:rPr>
-        <w:t xml:space="preserve"> od wroga</w:t>
-      </w:r>
-      <w:r>
-        <w:rPr>
-          <w:sz w:val="18"/>
-          <w:szCs w:val="18"/>
-        </w:rPr>
-        <w:t>.</w:t>
-      </w:r>
-    </w:p>
-    <w:p>
-      <w:pPr>
-        <w:spacing w:after="0"/>
-        <w:rPr>
-          <w:sz w:val="18"/>
-          <w:szCs w:val="18"/>
-        </w:rPr>
-      </w:pPr>
-      <w:r>
-        <w:rPr>
-          <w:b/>
-          <w:bCs/>
-          <w:sz w:val="18"/>
-          <w:szCs w:val="18"/>
-        </w:rPr>
-        <w:t>Zwiadowca:</w:t>
-      </w:r>
-      <w:r>
-        <w:rPr>
-          <w:sz w:val="18"/>
-          <w:szCs w:val="18"/>
-        </w:rPr>
-        <w:t xml:space="preserve"> </w:t>
-      </w:r>
-      <w:r>
-        <w:rPr>
-          <w:sz w:val="18"/>
-          <w:szCs w:val="18"/>
-        </w:rPr>
-        <w:t xml:space="preserve">Po </w:t>
-      </w:r>
-      <w:r>
-        <w:rPr>
-          <w:sz w:val="18"/>
-          <w:szCs w:val="18"/>
-        </w:rPr>
-        <w:t xml:space="preserve">rozstawieniu przesuń </w:t>
-      </w:r>
-      <w:r>
-        <w:rPr>
-          <w:sz w:val="18"/>
-          <w:szCs w:val="18"/>
-        </w:rPr>
-        <w:t>go o miarkę.</w:t>
-      </w:r>
-    </w:p>
-    <w:p>
-      <w:pPr>
-        <w:spacing w:after="0"/>
-        <w:rPr>
-          <w:sz w:val="18"/>
-          <w:szCs w:val="18"/>
-        </w:rPr>
-      </w:pPr>
-      <w:r>
-        <w:rPr>
-          <w:b/>
-          <w:bCs/>
-          <w:sz w:val="18"/>
-          <w:szCs w:val="18"/>
-        </w:rPr>
-        <w:t>Zwinny:</w:t>
-      </w:r>
-      <w:r>
-        <w:rPr>
-          <w:sz w:val="18"/>
-          <w:szCs w:val="18"/>
-        </w:rPr>
-        <w:t xml:space="preserve"> Może się ruszać nawet gdy ma wroga wręcz.</w:t>
-      </w:r>
-    </w:p>
-    <w:p>
-      <w:pPr>
-        <w:spacing w:after="0"/>
-        <w:rPr>
-          <w:sz w:val="18"/>
-          <w:szCs w:val="18"/>
-        </w:rPr>
-      </w:pPr>
-      <w:r>
-        <w:rPr>
-          <w:b/>
-          <w:bCs/>
-          <w:sz w:val="18"/>
-          <w:szCs w:val="18"/>
-        </w:rPr>
-        <w:t>Szybki</w:t>
-      </w:r>
-      <w:r>
-        <w:rPr>
-          <w:b/>
-          <w:bCs/>
-          <w:sz w:val="18"/>
-          <w:szCs w:val="18"/>
-        </w:rPr>
-        <w:t>:</w:t>
-      </w:r>
-      <w:r>
-        <w:rPr>
-          <w:sz w:val="18"/>
-          <w:szCs w:val="18"/>
-        </w:rPr>
-        <w:t xml:space="preserve"> Zamiast atakować może wykonać dodatkowy ruch.</w:t>
-      </w:r>
-    </w:p>
-    <w:p>
-      <w:pPr>
-        <w:spacing w:after="0"/>
-        <w:rPr>
-          <w:sz w:val="18"/>
-          <w:szCs w:val="18"/>
-        </w:rPr>
-      </w:pPr>
-      <w:r>
-        <w:rPr>
-          <w:b/>
-          <w:bCs/>
-          <w:sz w:val="18"/>
-          <w:szCs w:val="18"/>
-        </w:rPr>
-        <w:t xml:space="preserve">Nieruchomy: </w:t>
-      </w:r>
-      <w:r>
-        <w:rPr>
-          <w:sz w:val="18"/>
-          <w:szCs w:val="18"/>
-        </w:rPr>
-        <w:t>Nie może się ruszać.</w:t>
-      </w:r>
-    </w:p>
-    <w:p>
-      <w:pPr>
-        <w:spacing w:after="0"/>
-        <w:rPr>
-          <w:sz w:val="18"/>
-          <w:szCs w:val="18"/>
-        </w:rPr>
-      </w:pPr>
-      <w:r>
-        <w:rPr>
-          <w:b/>
-          <w:bCs/>
-          <w:sz w:val="18"/>
-          <w:szCs w:val="18"/>
-        </w:rPr>
-        <w:t>Skok</w:t>
-      </w:r>
-      <w:r>
-        <w:rPr>
-          <w:b/>
-          <w:bCs/>
-          <w:sz w:val="18"/>
-          <w:szCs w:val="18"/>
-        </w:rPr>
-        <w:t>:</w:t>
-      </w:r>
-      <w:r>
-        <w:rPr>
-          <w:sz w:val="18"/>
-          <w:szCs w:val="18"/>
-        </w:rPr>
-        <w:t xml:space="preserve"> Ignoruje teren i jednostki podczas ruchu.</w:t>
-      </w:r>
-      <w:r>
-        <w:rPr>
-          <w:sz w:val="18"/>
-          <w:szCs w:val="18"/>
-        </w:rPr>
-        <w:t xml:space="preserve"> </w:t>
-      </w:r>
-    </w:p>
-    <w:p>
-      <w:pPr>
-        <w:spacing w:after="0"/>
-        <w:rPr>
-          <w:sz w:val="18"/>
-          <w:szCs w:val="18"/>
-        </w:rPr>
-      </w:pPr>
-      <w:r>
-        <w:rPr>
-          <w:b/>
-          <w:bCs/>
-          <w:sz w:val="18"/>
-          <w:szCs w:val="18"/>
-        </w:rPr>
-        <w:t>Unik:</w:t>
-      </w:r>
-      <w:r>
-        <w:rPr>
-          <w:sz w:val="18"/>
-          <w:szCs w:val="18"/>
-        </w:rPr>
-        <w:t xml:space="preserve"> </w:t>
-      </w:r>
-      <w:r>
-        <w:rPr>
-          <w:sz w:val="18"/>
-          <w:szCs w:val="18"/>
-        </w:rPr>
-        <w:t xml:space="preserve">wrogowie atakujący </w:t>
-      </w:r>
-      <w:r>
-        <w:rPr>
-          <w:sz w:val="18"/>
-          <w:szCs w:val="18"/>
-        </w:rPr>
-        <w:t xml:space="preserve">cię </w:t>
-      </w:r>
-      <w:r>
-        <w:rPr>
-          <w:sz w:val="18"/>
-          <w:szCs w:val="18"/>
-        </w:rPr>
-        <w:t>nie będąc w zasięgu wręcz musza przerzucić wszystkie 6.</w:t>
-      </w:r>
-    </w:p>
-    <w:p>
-      <w:pPr>
-        <w:spacing w:after="0"/>
-        <w:rPr>
-          <w:sz w:val="18"/>
-          <w:szCs w:val="18"/>
-        </w:rPr>
-      </w:pPr>
-      <w:r>
-        <w:rPr>
-          <w:b/>
-          <w:bCs/>
-          <w:sz w:val="18"/>
-          <w:szCs w:val="18"/>
-        </w:rPr>
-        <w:t>Parowanie:</w:t>
-      </w:r>
-      <w:r>
-        <w:rPr>
-          <w:sz w:val="18"/>
-          <w:szCs w:val="18"/>
-        </w:rPr>
-        <w:t xml:space="preserve"> </w:t>
-      </w:r>
-      <w:r>
-        <w:rPr>
-          <w:sz w:val="18"/>
-          <w:szCs w:val="18"/>
-        </w:rPr>
-        <w:t xml:space="preserve">wrogowie atakujący </w:t>
-      </w:r>
-      <w:r>
-        <w:rPr>
-          <w:sz w:val="18"/>
-          <w:szCs w:val="18"/>
-        </w:rPr>
-        <w:t xml:space="preserve">cię </w:t>
-      </w:r>
-      <w:r>
-        <w:rPr>
-          <w:sz w:val="18"/>
-          <w:szCs w:val="18"/>
-        </w:rPr>
-        <w:t>będąc w zasięgu wręcz musza przerzucić wszystkie 6.</w:t>
-      </w:r>
-    </w:p>
-    <w:p>
-      <w:pPr>
-        <w:spacing w:after="0"/>
-        <w:rPr>
-          <w:sz w:val="18"/>
-          <w:szCs w:val="18"/>
-        </w:rPr>
-      </w:pPr>
-      <w:r>
-        <w:rPr>
-          <w:b/>
-          <w:bCs/>
-          <w:sz w:val="18"/>
-          <w:szCs w:val="18"/>
-        </w:rPr>
-        <w:t>Wytrwały:</w:t>
-      </w:r>
-      <w:r>
-        <w:rPr>
-          <w:sz w:val="18"/>
-          <w:szCs w:val="18"/>
-        </w:rPr>
-        <w:t xml:space="preserve">  +1 do obrony za każdy</w:t>
-      </w:r>
-      <w:r>
-        <w:rPr>
-          <w:sz w:val="18"/>
-          <w:szCs w:val="18"/>
-        </w:rPr>
-        <w:t xml:space="preserve"> znacznik</w:t>
-      </w:r>
-      <w:r>
-        <w:rPr>
-          <w:sz w:val="18"/>
-          <w:szCs w:val="18"/>
-        </w:rPr>
-        <w:t xml:space="preserve"> a</w:t>
-      </w:r>
-      <w:r>
-        <w:rPr>
-          <w:sz w:val="18"/>
-          <w:szCs w:val="18"/>
-        </w:rPr>
-        <w:t>ktywacji.</w:t>
-      </w:r>
-    </w:p>
-    <w:p>
-      <w:pPr>
-        <w:spacing w:after="0"/>
-        <w:rPr>
-          <w:b/>
-          <w:bCs/>
-          <w:sz w:val="18"/>
-          <w:szCs w:val="18"/>
-        </w:rPr>
-      </w:pPr>
-      <w:r>
-        <w:rPr>
-          <w:b/>
-          <w:bCs/>
-          <w:sz w:val="18"/>
-          <w:szCs w:val="18"/>
-        </w:rPr>
-        <w:t>Cierpliwy:</w:t>
-      </w:r>
-      <w:r>
-        <w:rPr>
-          <w:sz w:val="18"/>
-          <w:szCs w:val="18"/>
-        </w:rPr>
-        <w:t xml:space="preserve"> +1 </w:t>
-      </w:r>
-      <w:r>
-        <w:rPr>
-          <w:sz w:val="18"/>
-          <w:szCs w:val="18"/>
-        </w:rPr>
-        <w:t>do ataku za każdy znacznik aktywacji na celu</w:t>
-      </w:r>
-      <w:r>
-        <w:rPr>
-          <w:sz w:val="18"/>
-          <w:szCs w:val="18"/>
-        </w:rPr>
-        <w:t>.</w:t>
-      </w:r>
-    </w:p>
-    <w:p>
-      <w:pPr>
-        <w:spacing w:after="0"/>
-        <w:rPr>
-          <w:sz w:val="18"/>
-          <w:szCs w:val="18"/>
-        </w:rPr>
-      </w:pPr>
-      <w:r>
-        <w:rPr>
-          <w:b/>
-          <w:bCs/>
-          <w:sz w:val="18"/>
-          <w:szCs w:val="18"/>
-        </w:rPr>
-        <w:t>Przełamanie:</w:t>
-      </w:r>
-      <w:r>
-        <w:rPr>
-          <w:sz w:val="18"/>
-          <w:szCs w:val="18"/>
-        </w:rPr>
-        <w:t xml:space="preserve"> Jeżeli cel ataku </w:t>
-      </w:r>
-      <w:r>
-        <w:rPr>
-          <w:sz w:val="18"/>
-          <w:szCs w:val="18"/>
-        </w:rPr>
-        <w:t xml:space="preserve">jest </w:t>
-      </w:r>
-      <w:r>
-        <w:rPr>
-          <w:sz w:val="18"/>
-          <w:szCs w:val="18"/>
-        </w:rPr>
-        <w:t xml:space="preserve">w zasięgu </w:t>
-      </w:r>
-      <w:r>
-        <w:rPr>
-          <w:sz w:val="18"/>
-          <w:szCs w:val="18"/>
-        </w:rPr>
-        <w:t>wręcz od</w:t>
-      </w:r>
-      <w:r>
-        <w:rPr>
-          <w:sz w:val="18"/>
-          <w:szCs w:val="18"/>
-        </w:rPr>
-        <w:t xml:space="preserve"> celu misji, </w:t>
-      </w:r>
-      <w:r>
-        <w:rPr>
-          <w:sz w:val="18"/>
-          <w:szCs w:val="18"/>
-        </w:rPr>
-        <w:t>możesz przerzucić wszystkie 1.</w:t>
-      </w:r>
-    </w:p>
-    <w:p>
-      <w:pPr>
-        <w:spacing w:after="0"/>
-        <w:rPr>
-          <w:sz w:val="18"/>
-          <w:szCs w:val="18"/>
-        </w:rPr>
-      </w:pPr>
-      <w:r>
-        <w:rPr>
-          <w:b/>
-          <w:bCs/>
-          <w:sz w:val="18"/>
-          <w:szCs w:val="18"/>
-        </w:rPr>
-        <w:t>Strażnik:</w:t>
-      </w:r>
-      <w:r>
-        <w:rPr>
-          <w:sz w:val="18"/>
-          <w:szCs w:val="18"/>
-        </w:rPr>
-        <w:t xml:space="preserve"> </w:t>
-      </w:r>
-      <w:r>
-        <w:rPr>
-          <w:sz w:val="18"/>
-          <w:szCs w:val="18"/>
-        </w:rPr>
-        <w:t xml:space="preserve">Jeżeli jesteś </w:t>
-      </w:r>
-      <w:r>
-        <w:rPr>
-          <w:sz w:val="18"/>
-          <w:szCs w:val="18"/>
-        </w:rPr>
-        <w:t xml:space="preserve">w zasięgu wręcz </w:t>
-      </w:r>
-      <w:r>
-        <w:rPr>
-          <w:sz w:val="18"/>
-          <w:szCs w:val="18"/>
-        </w:rPr>
-        <w:t xml:space="preserve">od celu misji, </w:t>
-      </w:r>
-      <w:r>
-        <w:rPr>
-          <w:sz w:val="18"/>
-          <w:szCs w:val="18"/>
-        </w:rPr>
-        <w:t>możesz przerzucić wszystkie 1.</w:t>
-      </w:r>
-    </w:p>
-    <w:p>
-      <w:pPr>
-        <w:spacing w:after="0"/>
-        <w:rPr>
-          <w:sz w:val="18"/>
-          <w:szCs w:val="18"/>
-        </w:rPr>
-      </w:pPr>
-      <w:r>
-        <w:rPr>
-          <w:b/>
-          <w:bCs/>
-          <w:sz w:val="18"/>
-          <w:szCs w:val="18"/>
-        </w:rPr>
-        <w:t>Kontratak:</w:t>
-      </w:r>
-      <w:r>
-        <w:rPr>
-          <w:sz w:val="18"/>
-          <w:szCs w:val="18"/>
-        </w:rPr>
-        <w:t xml:space="preserve"> Atakujący wręcz</w:t>
-      </w:r>
-      <w:r>
-        <w:rPr>
-          <w:sz w:val="18"/>
-          <w:szCs w:val="18"/>
-        </w:rPr>
-        <w:t xml:space="preserve"> otrzymuje 1 ranę za każdą porażkę.</w:t>
-      </w:r>
-    </w:p>
-    <w:p>
-      <w:pPr>
-        <w:spacing w:after="0"/>
-        <w:rPr>
-          <w:sz w:val="18"/>
-          <w:szCs w:val="18"/>
-        </w:rPr>
-      </w:pPr>
-      <w:r>
-        <w:rPr>
-          <w:b/>
-          <w:bCs/>
-          <w:sz w:val="18"/>
-          <w:szCs w:val="18"/>
-        </w:rPr>
-        <w:t>Samolot:</w:t>
-      </w:r>
-      <w:r>
-        <w:rPr>
-          <w:sz w:val="18"/>
-          <w:szCs w:val="18"/>
-        </w:rPr>
-        <w:t xml:space="preserve"> </w:t>
-      </w:r>
-      <w:r>
-        <w:rPr>
-          <w:sz w:val="18"/>
-          <w:szCs w:val="18"/>
-        </w:rPr>
-        <w:t>Ma nieograniczony ruch</w:t>
-      </w:r>
-      <w:r>
-        <w:rPr>
-          <w:sz w:val="18"/>
-          <w:szCs w:val="18"/>
-        </w:rPr>
-        <w:t xml:space="preserve">, jest w dalekim zasięgu od wszystkiego, można przez niego patrzeć i </w:t>
-      </w:r>
-      <w:r>
-        <w:rPr>
-          <w:sz w:val="18"/>
-          <w:szCs w:val="18"/>
-        </w:rPr>
-        <w:t>przemieszczać się.</w:t>
-      </w:r>
-    </w:p>
-    <w:p>
-      <w:pPr>
-        <w:spacing w:after="0"/>
-        <w:rPr>
-          <w:sz w:val="18"/>
-          <w:szCs w:val="18"/>
-        </w:rPr>
-      </w:pPr>
-    </w:p>
-    <w:p>
-      <w:pPr>
-        <w:spacing w:after="0"/>
-        <w:rPr>
-          <w:b/>
-          <w:bCs/>
-          <w:sz w:val="18"/>
-          <w:szCs w:val="18"/>
-        </w:rPr>
-      </w:pPr>
-      <w:r>
-        <w:rPr>
-          <w:b/>
-          <w:bCs/>
-          <w:sz w:val="18"/>
-          <w:szCs w:val="18"/>
-        </w:rPr>
-        <w:t>Zdolności specjalne:</w:t>
-      </w:r>
-      <w:r>
-        <w:rPr>
-          <w:sz w:val="18"/>
-          <w:szCs w:val="18"/>
-        </w:rPr>
-        <w:t xml:space="preserve"> gracz decyduje o ich wykorzystaniu</w:t>
-      </w:r>
-      <w:r>
-        <w:rPr>
-          <w:sz w:val="18"/>
-          <w:szCs w:val="18"/>
-        </w:rPr>
-        <w:t>.</w:t>
-      </w:r>
-      <w:r>
-        <w:rPr>
-          <w:sz w:val="18"/>
-          <w:szCs w:val="18"/>
-        </w:rPr>
-        <w:t xml:space="preserve"> Są przypisane do oddziału.</w:t>
-      </w:r>
-    </w:p>
-    <w:p>
-      <w:pPr>
-        <w:spacing w:after="0"/>
-        <w:rPr>
-          <w:sz w:val="18"/>
-          <w:szCs w:val="18"/>
-        </w:rPr>
-      </w:pPr>
-      <w:r>
-        <w:rPr>
-          <w:b/>
-          <w:bCs/>
-          <w:sz w:val="18"/>
-          <w:szCs w:val="18"/>
-        </w:rPr>
-        <w:t>Łatanie:</w:t>
-      </w:r>
-      <w:r>
-        <w:rPr>
-          <w:sz w:val="18"/>
-          <w:szCs w:val="18"/>
-        </w:rPr>
-        <w:t xml:space="preserve"> </w:t>
-      </w:r>
-      <w:r>
-        <w:rPr>
-          <w:sz w:val="18"/>
-          <w:szCs w:val="18"/>
-        </w:rPr>
-        <w:t xml:space="preserve">Na koniec aktywacji </w:t>
-      </w:r>
-      <w:r>
-        <w:rPr>
-          <w:sz w:val="18"/>
-          <w:szCs w:val="18"/>
-        </w:rPr>
-        <w:t>ten</w:t>
-      </w:r>
-      <w:r>
-        <w:rPr>
-          <w:sz w:val="18"/>
-          <w:szCs w:val="18"/>
-        </w:rPr>
-        <w:t xml:space="preserve"> </w:t>
-      </w:r>
-      <w:r>
-        <w:rPr>
-          <w:sz w:val="18"/>
-          <w:szCs w:val="18"/>
-        </w:rPr>
-        <w:t xml:space="preserve">oddział </w:t>
-      </w:r>
-      <w:r>
-        <w:rPr>
-          <w:sz w:val="18"/>
-          <w:szCs w:val="18"/>
-        </w:rPr>
-        <w:t xml:space="preserve">lub inny </w:t>
-      </w:r>
-      <w:r>
-        <w:rPr>
-          <w:sz w:val="18"/>
-          <w:szCs w:val="18"/>
-        </w:rPr>
-        <w:t xml:space="preserve">w </w:t>
-      </w:r>
-      <w:r>
-        <w:rPr>
-          <w:sz w:val="18"/>
-          <w:szCs w:val="18"/>
-        </w:rPr>
-        <w:t xml:space="preserve">zasięgu </w:t>
-      </w:r>
-      <w:r>
-        <w:rPr>
-          <w:sz w:val="18"/>
-          <w:szCs w:val="18"/>
-        </w:rPr>
-        <w:t xml:space="preserve">wręcz </w:t>
-      </w:r>
-      <w:r>
-        <w:rPr>
-          <w:sz w:val="18"/>
-          <w:szCs w:val="18"/>
-        </w:rPr>
-        <w:t>leczy ranę</w:t>
-      </w:r>
-      <w:r>
-        <w:rPr>
-          <w:sz w:val="18"/>
-          <w:szCs w:val="18"/>
-        </w:rPr>
-        <w:t>.</w:t>
-      </w:r>
-    </w:p>
-    <w:p>
-      <w:pPr>
-        <w:spacing w:after="0"/>
-        <w:rPr>
-          <w:sz w:val="18"/>
-          <w:szCs w:val="18"/>
-        </w:rPr>
-      </w:pPr>
-      <w:r>
-        <w:rPr>
-          <w:b/>
-          <w:bCs/>
-          <w:sz w:val="18"/>
-          <w:szCs w:val="18"/>
-        </w:rPr>
-        <w:t xml:space="preserve">Aura (X): </w:t>
-      </w:r>
-      <w:r>
-        <w:rPr>
-          <w:sz w:val="18"/>
-          <w:szCs w:val="18"/>
-        </w:rPr>
-        <w:t>Przyjazne</w:t>
-      </w:r>
-      <w:r>
-        <w:rPr>
-          <w:sz w:val="18"/>
-          <w:szCs w:val="18"/>
-        </w:rPr>
-        <w:t xml:space="preserve"> oddziały</w:t>
-      </w:r>
-      <w:r>
-        <w:rPr>
-          <w:sz w:val="18"/>
-          <w:szCs w:val="18"/>
-        </w:rPr>
-        <w:t xml:space="preserve"> w zasięgu jednej</w:t>
-      </w:r>
-      <w:r>
-        <w:rPr>
-          <w:sz w:val="18"/>
-          <w:szCs w:val="18"/>
-        </w:rPr>
-        <w:t xml:space="preserve">, lub </w:t>
-      </w:r>
-      <w:r>
-        <w:rPr>
-          <w:sz w:val="18"/>
-          <w:szCs w:val="18"/>
-        </w:rPr>
-        <w:t>ich profile ataku,</w:t>
-      </w:r>
-      <w:r>
-        <w:rPr>
-          <w:sz w:val="18"/>
-          <w:szCs w:val="18"/>
-        </w:rPr>
-        <w:t xml:space="preserve"> miarki mają zdolność X</w:t>
-      </w:r>
-      <w:r>
-        <w:rPr>
-          <w:sz w:val="18"/>
-          <w:szCs w:val="18"/>
-        </w:rPr>
-        <w:t>.</w:t>
-      </w:r>
-    </w:p>
-    <w:p>
-      <w:pPr>
-        <w:spacing w:after="0"/>
-        <w:rPr>
-          <w:sz w:val="18"/>
-          <w:szCs w:val="18"/>
-        </w:rPr>
-      </w:pPr>
-      <w:r>
-        <w:rPr>
-          <w:b/>
-          <w:bCs/>
-          <w:sz w:val="18"/>
-          <w:szCs w:val="18"/>
-        </w:rPr>
-        <w:t>Rozkaz</w:t>
-      </w:r>
-      <w:r>
-        <w:rPr>
-          <w:b/>
-          <w:bCs/>
-          <w:sz w:val="18"/>
-          <w:szCs w:val="18"/>
-        </w:rPr>
-        <w:t>:</w:t>
-      </w:r>
-      <w:r>
-        <w:rPr>
-          <w:sz w:val="18"/>
-          <w:szCs w:val="18"/>
-        </w:rPr>
-        <w:t xml:space="preserve"> </w:t>
-      </w:r>
-      <w:r>
-        <w:rPr>
-          <w:sz w:val="18"/>
-          <w:szCs w:val="18"/>
-        </w:rPr>
-        <w:t>Po twojej aktywacji możesz aktywować następny oddział</w:t>
-      </w:r>
-      <w:r>
-        <w:rPr>
-          <w:sz w:val="18"/>
-          <w:szCs w:val="18"/>
-        </w:rPr>
-        <w:t xml:space="preserve"> bez tej zdolności</w:t>
-      </w:r>
-      <w:r>
-        <w:rPr>
-          <w:sz w:val="18"/>
-          <w:szCs w:val="18"/>
-        </w:rPr>
-        <w:t>, nawet jeżeli ma już znacznik aktywacji.</w:t>
-      </w:r>
-      <w:r>
-        <w:rPr>
-          <w:sz w:val="18"/>
-          <w:szCs w:val="18"/>
-        </w:rPr>
-        <w:t xml:space="preserve"> (Dostaje </w:t>
-      </w:r>
-      <w:r>
-        <w:rPr>
-          <w:sz w:val="18"/>
-          <w:szCs w:val="18"/>
-        </w:rPr>
-        <w:t>znacznik aktywacji).</w:t>
-      </w:r>
-    </w:p>
-    <w:p>
-      <w:pPr>
-        <w:spacing w:after="0"/>
-        <w:rPr>
-          <w:sz w:val="18"/>
-          <w:szCs w:val="18"/>
-        </w:rPr>
-      </w:pPr>
-      <w:r>
-        <w:rPr>
-          <w:b/>
-          <w:bCs/>
-          <w:sz w:val="18"/>
-          <w:szCs w:val="18"/>
-        </w:rPr>
-        <w:t>Transport:</w:t>
-      </w:r>
-      <w:r>
-        <w:rPr>
-          <w:sz w:val="18"/>
-          <w:szCs w:val="18"/>
-        </w:rPr>
-        <w:t xml:space="preserve"> Zanim wykona ruch </w:t>
-      </w:r>
-      <w:r>
-        <w:rPr>
-          <w:sz w:val="18"/>
-          <w:szCs w:val="18"/>
-        </w:rPr>
-        <w:t xml:space="preserve">przyjazne </w:t>
-      </w:r>
-      <w:r>
-        <w:rPr>
-          <w:sz w:val="18"/>
-          <w:szCs w:val="18"/>
-        </w:rPr>
-        <w:t>oddziały wręcz od niego mogą zostać zdjęte z planszy i rozstawione ponownie</w:t>
-      </w:r>
-      <w:r>
-        <w:rPr>
-          <w:sz w:val="18"/>
-          <w:szCs w:val="18"/>
-        </w:rPr>
-        <w:t xml:space="preserve"> wręcz od niego</w:t>
-      </w:r>
-      <w:r>
-        <w:rPr>
-          <w:sz w:val="18"/>
-          <w:szCs w:val="18"/>
-        </w:rPr>
-        <w:t>,</w:t>
-      </w:r>
-      <w:r>
-        <w:rPr>
-          <w:sz w:val="18"/>
-          <w:szCs w:val="18"/>
-        </w:rPr>
-        <w:t xml:space="preserve"> gdy zakończy ruch</w:t>
-      </w:r>
-      <w:r>
-        <w:rPr>
-          <w:sz w:val="18"/>
-          <w:szCs w:val="18"/>
-        </w:rPr>
-        <w:t>.</w:t>
-      </w:r>
-    </w:p>
-    <w:p>
-      <w:pPr>
-        <w:spacing w:after="0"/>
-        <w:rPr>
-          <w:b/>
-          <w:bCs/>
-          <w:sz w:val="18"/>
-          <w:szCs w:val="18"/>
-        </w:rPr>
-      </w:pPr>
-    </w:p>
-    <w:p>
-      <w:pPr>
-        <w:spacing w:after="0"/>
-        <w:rPr>
-          <w:sz w:val="18"/>
-          <w:szCs w:val="18"/>
-        </w:rPr>
-      </w:pPr>
-      <w:r>
-        <w:rPr>
-          <w:b/>
-          <w:bCs/>
-          <w:sz w:val="18"/>
-          <w:szCs w:val="18"/>
-        </w:rPr>
-        <w:t xml:space="preserve">Zdolności </w:t>
-      </w:r>
-      <w:r>
-        <w:rPr>
-          <w:b/>
-          <w:bCs/>
-          <w:sz w:val="18"/>
-          <w:szCs w:val="18"/>
-        </w:rPr>
-        <w:t xml:space="preserve">ataku: </w:t>
-      </w:r>
-      <w:r>
-        <w:rPr>
-          <w:sz w:val="18"/>
-          <w:szCs w:val="18"/>
-        </w:rPr>
-        <w:t>przypisane do p</w:t>
-      </w:r>
-      <w:r>
-        <w:rPr>
-          <w:sz w:val="18"/>
-          <w:szCs w:val="18"/>
-        </w:rPr>
-        <w:t>rofilu ataku</w:t>
-      </w:r>
-      <w:r>
-        <w:rPr>
-          <w:sz w:val="18"/>
-          <w:szCs w:val="18"/>
-        </w:rPr>
-        <w:t>.</w:t>
-      </w:r>
-    </w:p>
-    <w:p>
-      <w:pPr>
-        <w:spacing w:after="0"/>
-        <w:rPr>
-          <w:sz w:val="18"/>
-          <w:szCs w:val="18"/>
-        </w:rPr>
-      </w:pPr>
-      <w:r>
-        <w:rPr>
-          <w:b/>
-          <w:bCs/>
-          <w:sz w:val="18"/>
-          <w:szCs w:val="18"/>
-        </w:rPr>
-        <w:t>Obszarowa</w:t>
-      </w:r>
-      <w:r>
-        <w:rPr>
-          <w:b/>
-          <w:bCs/>
-          <w:sz w:val="18"/>
-          <w:szCs w:val="18"/>
-        </w:rPr>
-        <w:t>:</w:t>
-      </w:r>
-      <w:r>
-        <w:rPr>
-          <w:sz w:val="18"/>
-          <w:szCs w:val="18"/>
-        </w:rPr>
-        <w:t xml:space="preserve"> </w:t>
-      </w:r>
-      <w:r>
-        <w:rPr>
-          <w:sz w:val="18"/>
-          <w:szCs w:val="18"/>
-        </w:rPr>
-        <w:t>Masz doda</w:t>
-      </w:r>
-      <w:r>
-        <w:rPr>
-          <w:sz w:val="18"/>
-          <w:szCs w:val="18"/>
-        </w:rPr>
-        <w:t>t</w:t>
-      </w:r>
-      <w:r>
-        <w:rPr>
-          <w:sz w:val="18"/>
-          <w:szCs w:val="18"/>
-        </w:rPr>
-        <w:t>kową kość ataku</w:t>
-      </w:r>
-      <w:r>
-        <w:rPr>
-          <w:sz w:val="18"/>
-          <w:szCs w:val="18"/>
-        </w:rPr>
-        <w:t xml:space="preserve"> </w:t>
-      </w:r>
-      <w:r>
-        <w:rPr>
-          <w:sz w:val="18"/>
-          <w:szCs w:val="18"/>
-        </w:rPr>
-        <w:t xml:space="preserve">za każdy </w:t>
-      </w:r>
-      <w:r>
-        <w:rPr>
-          <w:sz w:val="18"/>
-          <w:szCs w:val="18"/>
-        </w:rPr>
-        <w:t>model który jest wręcz od celu.</w:t>
-      </w:r>
-      <w:r>
-        <w:rPr>
-          <w:sz w:val="18"/>
-          <w:szCs w:val="18"/>
-        </w:rPr>
-        <w:t xml:space="preserve"> Jeżeli atakujesz oddział, celem jest </w:t>
-      </w:r>
-      <w:r>
-        <w:rPr>
-          <w:sz w:val="18"/>
-          <w:szCs w:val="18"/>
-        </w:rPr>
-        <w:t xml:space="preserve">najbliższy model. </w:t>
-      </w:r>
-      <w:r>
-        <w:rPr>
-          <w:sz w:val="18"/>
-          <w:szCs w:val="18"/>
-        </w:rPr>
-        <w:t>Jeżeli dodatkowe modele należą do innego oddziału, dodatkowe kości atakują te oddziały.</w:t>
-      </w:r>
-    </w:p>
-    <w:p>
-      <w:pPr>
-        <w:spacing w:after="0"/>
-        <w:rPr>
-          <w:sz w:val="18"/>
-          <w:szCs w:val="18"/>
-        </w:rPr>
-      </w:pPr>
-      <w:r>
-        <w:rPr>
-          <w:b/>
-          <w:bCs/>
-          <w:sz w:val="18"/>
-          <w:szCs w:val="18"/>
-        </w:rPr>
-        <w:t>Zabójczy:</w:t>
-      </w:r>
-      <w:r>
-        <w:rPr>
-          <w:sz w:val="18"/>
-          <w:szCs w:val="18"/>
-        </w:rPr>
-        <w:t xml:space="preserve"> </w:t>
-      </w:r>
-      <w:r>
-        <w:rPr>
-          <w:sz w:val="18"/>
-          <w:szCs w:val="18"/>
-        </w:rPr>
         <w:t>Za</w:t>
       </w:r>
       <w:r>
@@ -2835,14 +3029,21 @@
           <w:sz w:val="18"/>
           <w:szCs w:val="18"/>
         </w:rPr>
-        <w:t xml:space="preserve"> lub mniej wytrzymałoś</w:t>
-      </w:r>
-      <w:r>
-        <w:rPr>
-          <w:sz w:val="18"/>
-          <w:szCs w:val="18"/>
-        </w:rPr>
-        <w:t xml:space="preserve">ci, a jeżeli więcej zadaj </w:t>
+        <w:t xml:space="preserve"> lub mniej </w:t>
+      </w:r>
+      <w:r>
+        <w:rPr>
+          <w:sz w:val="18"/>
+          <w:szCs w:val="18"/>
+        </w:rPr>
+        <w:t>Życia</w:t>
+      </w:r>
+      <w:r>
+        <w:rPr>
+          <w:sz w:val="18"/>
+          <w:szCs w:val="18"/>
+        </w:rPr>
+        <w:t xml:space="preserve">, a jeżeli więcej zadaj </w:t>
       </w:r>
       <w:r>
         <w:rPr>
@@ -3148,7 +3349,101 @@
           <w:sz w:val="18"/>
           <w:szCs w:val="18"/>
         </w:rPr>
-        <w:t xml:space="preserve">) * </w:t>
+        <w:t>) * m</w:t>
+      </w:r>
+      <w:r>
+        <w:rPr>
+          <w:sz w:val="18"/>
+          <w:szCs w:val="18"/>
+        </w:rPr>
+        <w:t xml:space="preserve">odyfikator </w:t>
+      </w:r>
+      <w:r>
+        <w:rPr>
+          <w:sz w:val="18"/>
+          <w:szCs w:val="18"/>
+        </w:rPr>
+        <w:t>ży</w:t>
+      </w:r>
+      <w:r>
+        <w:rPr>
+          <w:sz w:val="18"/>
+          <w:szCs w:val="18"/>
+        </w:rPr>
+        <w:t>c</w:t>
+      </w:r>
+      <w:r>
+        <w:rPr>
+          <w:sz w:val="18"/>
+          <w:szCs w:val="18"/>
+        </w:rPr>
+        <w:t>i</w:t>
+      </w:r>
+      <w:r>
+        <w:rPr>
+          <w:sz w:val="18"/>
+          <w:szCs w:val="18"/>
+        </w:rPr>
+        <w:t>a</w:t>
+      </w:r>
+    </w:p>
+    <w:p>
+      <w:pPr>
+        <w:spacing w:after="0"/>
+        <w:rPr>
+          <w:sz w:val="18"/>
+          <w:szCs w:val="18"/>
+        </w:rPr>
+      </w:pPr>
+      <w:r>
+        <w:rPr>
+          <w:b/>
+          <w:bCs/>
+          <w:sz w:val="18"/>
+          <w:szCs w:val="18"/>
+        </w:rPr>
+        <w:t>M</w:t>
+      </w:r>
+      <w:r>
+        <w:rPr>
+          <w:b/>
+          <w:bCs/>
+          <w:sz w:val="18"/>
+          <w:szCs w:val="18"/>
+        </w:rPr>
+        <w:t xml:space="preserve">odyfikator </w:t>
+      </w:r>
+      <w:r>
+        <w:rPr>
+          <w:b/>
+          <w:bCs/>
+          <w:sz w:val="18"/>
+          <w:szCs w:val="18"/>
+        </w:rPr>
+        <w:t>ż</w:t>
+      </w:r>
+      <w:r>
+        <w:rPr>
+          <w:b/>
+          <w:bCs/>
+          <w:sz w:val="18"/>
+          <w:szCs w:val="18"/>
+        </w:rPr>
+        <w:t>ycia</w:t>
+      </w:r>
+      <w:r>
+        <w:rPr>
+          <w:sz w:val="18"/>
+          <w:szCs w:val="18"/>
+        </w:rPr>
+        <w:t xml:space="preserve"> wynosi 1+0,01 * </w:t>
+      </w:r>
+      <w:r>
+        <w:rPr>
+          <w:sz w:val="18"/>
+          <w:szCs w:val="18"/>
+        </w:rPr>
+        <w:t>życie</w:t>
       </w:r>
       <w:r>
         <w:rPr>
@@ -3156,54 +3451,6 @@
           <w:szCs w:val="18"/>
         </w:rPr>
         <w:t xml:space="preserve"> </w:t>
-      </w:r>
-      <w:r>
-        <w:rPr>
-          <w:sz w:val="18"/>
-          <w:szCs w:val="18"/>
-        </w:rPr>
-        <w:t>m</w:t>
-      </w:r>
-      <w:r>
-        <w:rPr>
-          <w:sz w:val="18"/>
-          <w:szCs w:val="18"/>
-        </w:rPr>
-        <w:t>odyfikator wytrzymałości</w:t>
-      </w:r>
-    </w:p>
-    <w:p>
-      <w:pPr>
-        <w:spacing w:after="0"/>
-        <w:rPr>
-          <w:sz w:val="18"/>
-          <w:szCs w:val="18"/>
-        </w:rPr>
-      </w:pPr>
-      <w:r>
-        <w:rPr>
-          <w:b/>
-          <w:bCs/>
-          <w:sz w:val="18"/>
-          <w:szCs w:val="18"/>
-        </w:rPr>
-        <w:t>M</w:t>
-      </w:r>
-      <w:r>
-        <w:rPr>
-          <w:b/>
-          <w:bCs/>
-          <w:sz w:val="18"/>
-          <w:szCs w:val="18"/>
-        </w:rPr>
-        <w:t>odyfikator wytrzymałości</w:t>
-      </w:r>
-      <w:r>
-        <w:rPr>
-          <w:sz w:val="18"/>
-          <w:szCs w:val="18"/>
-        </w:rPr>
-        <w:t xml:space="preserve"> wynosi 1+0,01 * wytrzymałość </w:t>
       </w:r>
     </w:p>
     <w:tbl>
@@ -3234,7 +3481,7 @@
                 <w:sz w:val="18"/>
                 <w:szCs w:val="18"/>
               </w:rPr>
-              <w:t>Wytrzymałość</w:t>
+              <w:t>Życie</w:t>
             </w:r>
           </w:p>
         </w:tc>
@@ -3276,7 +3523,7 @@
                 <w:sz w:val="18"/>
                 <w:szCs w:val="18"/>
               </w:rPr>
-              <w:t>1</w:t>
+              <w:t>2</w:t>
             </w:r>
           </w:p>
         </w:tc>
@@ -3318,7 +3565,7 @@
                 <w:sz w:val="18"/>
                 <w:szCs w:val="18"/>
               </w:rPr>
-              <w:t>2</w:t>
+              <w:t>4</w:t>
             </w:r>
           </w:p>
         </w:tc>
@@ -3360,7 +3607,7 @@
                 <w:sz w:val="18"/>
                 <w:szCs w:val="18"/>
               </w:rPr>
-              <w:t>3</w:t>
+              <w:t>6</w:t>
             </w:r>
           </w:p>
         </w:tc>
@@ -3402,7 +3649,7 @@
                 <w:sz w:val="18"/>
                 <w:szCs w:val="18"/>
               </w:rPr>
-              <w:t>6</w:t>
+              <w:t>12</w:t>
             </w:r>
           </w:p>
         </w:tc>
@@ -3444,7 +3691,7 @@
                 <w:sz w:val="18"/>
                 <w:szCs w:val="18"/>
               </w:rPr>
-              <w:t>9</w:t>
+              <w:t>18</w:t>
             </w:r>
           </w:p>
         </w:tc>
@@ -3486,7 +3733,7 @@
                 <w:sz w:val="18"/>
                 <w:szCs w:val="18"/>
               </w:rPr>
-              <w:t>12</w:t>
+              <w:t>24</w:t>
             </w:r>
           </w:p>
         </w:tc>
@@ -3571,39 +3818,78 @@
           <w:sz w:val="18"/>
           <w:szCs w:val="18"/>
         </w:rPr>
-        <w:t xml:space="preserve"> modyfikator obrony </w:t>
-      </w:r>
-      <w:r>
-        <w:rPr>
-          <w:sz w:val="18"/>
-          <w:szCs w:val="18"/>
-        </w:rPr>
-        <w:t>* suma wytrzymałości modeli w oddziale.</w:t>
-      </w:r>
-    </w:p>
-    <w:p>
-      <w:pPr>
-        <w:spacing w:after="0"/>
-        <w:rPr>
-          <w:sz w:val="18"/>
-          <w:szCs w:val="18"/>
-        </w:rPr>
-      </w:pPr>
-      <w:r>
-        <w:rPr>
-          <w:b/>
-          <w:bCs/>
-          <w:sz w:val="18"/>
-          <w:szCs w:val="18"/>
-        </w:rPr>
-        <w:t xml:space="preserve">Modyfikator </w:t>
-      </w:r>
-      <w:r>
-        <w:rPr>
-          <w:sz w:val="18"/>
-          <w:szCs w:val="18"/>
-        </w:rPr>
-        <w:t>obrony</w:t>
+        <w:t xml:space="preserve"> modyfikator </w:t>
+      </w:r>
+      <w:r>
+        <w:rPr>
+          <w:sz w:val="18"/>
+          <w:szCs w:val="18"/>
+        </w:rPr>
+        <w:t>zbroi</w:t>
+      </w:r>
+      <w:r>
+        <w:rPr>
+          <w:sz w:val="18"/>
+          <w:szCs w:val="18"/>
+        </w:rPr>
+        <w:t xml:space="preserve"> </w:t>
+      </w:r>
+      <w:r>
+        <w:rPr>
+          <w:sz w:val="18"/>
+          <w:szCs w:val="18"/>
+        </w:rPr>
+        <w:t xml:space="preserve">* suma </w:t>
+      </w:r>
+      <w:r>
+        <w:rPr>
+          <w:sz w:val="18"/>
+          <w:szCs w:val="18"/>
+        </w:rPr>
+        <w:t>Życia</w:t>
+      </w:r>
+      <w:r>
+        <w:rPr>
+          <w:sz w:val="18"/>
+          <w:szCs w:val="18"/>
+        </w:rPr>
+        <w:t xml:space="preserve"> modeli w oddziale.</w:t>
+      </w:r>
+    </w:p>
+    <w:p>
+      <w:pPr>
+        <w:spacing w:after="0"/>
+        <w:rPr>
+          <w:sz w:val="18"/>
+          <w:szCs w:val="18"/>
+        </w:rPr>
+      </w:pPr>
+      <w:r>
+        <w:rPr>
+          <w:b/>
+          <w:bCs/>
+          <w:sz w:val="18"/>
+          <w:szCs w:val="18"/>
+        </w:rPr>
+        <w:t>Modyfikato</w:t>
+      </w:r>
+      <w:r>
+        <w:rPr>
+          <w:b/>
+          <w:bCs/>
+          <w:sz w:val="18"/>
+          <w:szCs w:val="18"/>
+        </w:rPr>
+        <w:t xml:space="preserve">r </w:t>
+      </w:r>
+      <w:r>
+        <w:rPr>
+          <w:b/>
+          <w:bCs/>
+          <w:sz w:val="18"/>
+          <w:szCs w:val="18"/>
+        </w:rPr>
+        <w:t>zbroi</w:t>
       </w:r>
       <w:r>
         <w:rPr>
@@ -3624,7 +3910,14 @@
           <w:sz w:val="18"/>
           <w:szCs w:val="18"/>
         </w:rPr>
-        <w:t>,09x^2-0,19x+1 gdzie x to efektywna obrona</w:t>
+        <w:t xml:space="preserve">,09x^2-0,19x+1 gdzie x to efektywna </w:t>
+      </w:r>
+      <w:r>
+        <w:rPr>
+          <w:sz w:val="18"/>
+          <w:szCs w:val="18"/>
+        </w:rPr>
+        <w:t>Zbroja</w:t>
       </w:r>
     </w:p>
     <w:tbl>
@@ -3749,7 +4042,7 @@
                 <w:sz w:val="18"/>
                 <w:szCs w:val="18"/>
               </w:rPr>
-              <w:t>Obrona</w:t>
+              <w:t>Zbroja</w:t>
             </w:r>
           </w:p>
         </w:tc>
@@ -3870,7 +4163,21 @@
           <w:sz w:val="18"/>
           <w:szCs w:val="18"/>
         </w:rPr>
-        <w:t xml:space="preserve"> sumę wytrzymałości oddzia</w:t>
+        <w:t xml:space="preserve"> sumę </w:t>
+      </w:r>
+      <w:r>
+        <w:rPr>
+          <w:sz w:val="18"/>
+          <w:szCs w:val="18"/>
+        </w:rPr>
+        <w:t>Życia</w:t>
+      </w:r>
+      <w:r>
+        <w:rPr>
+          <w:sz w:val="18"/>
+          <w:szCs w:val="18"/>
+        </w:rPr>
+        <w:t xml:space="preserve"> oddzia</w:t>
       </w:r>
       <w:r>
         <w:rPr>
@@ -3879,13 +4186,6 @@
         </w:rPr>
         <w:t>łu</w:t>
       </w:r>
-      <w:r>
-        <w:rPr>
-          <w:sz w:val="18"/>
-          <w:szCs w:val="18"/>
-        </w:rPr>
-        <w:t>.</w:t>
-      </w:r>
     </w:p>
     <w:p>
       <w:pPr>
@@ -4076,7 +4376,51 @@
           <w:sz w:val="18"/>
           <w:szCs w:val="18"/>
         </w:rPr>
-        <w:t>i.</w:t>
+        <w:t>i</w:t>
+      </w:r>
+    </w:p>
+    <w:p>
+      <w:pPr>
+        <w:spacing w:after="0"/>
+        <w:rPr>
+          <w:sz w:val="18"/>
+          <w:szCs w:val="18"/>
+        </w:rPr>
+      </w:pPr>
+      <w:r>
+        <w:rPr>
+          <w:sz w:val="18"/>
+          <w:szCs w:val="18"/>
+        </w:rPr>
+        <w:t xml:space="preserve">Niezgrabny: </w:t>
+      </w:r>
+      <w:r>
+        <w:rPr>
+          <w:sz w:val="18"/>
+          <w:szCs w:val="18"/>
+        </w:rPr>
+        <w:t xml:space="preserve">odlicz </w:t>
+      </w:r>
+      <w:r>
+        <w:rPr>
+          <w:sz w:val="18"/>
+          <w:szCs w:val="18"/>
+        </w:rPr>
+        <w:t>1</w:t>
+      </w:r>
+      <w:r>
+        <w:rPr>
+          <w:sz w:val="18"/>
+          <w:szCs w:val="18"/>
+        </w:rPr>
+        <w:t xml:space="preserve"> od kosztu </w:t>
+      </w:r>
+      <w:r>
+        <w:rPr>
+          <w:sz w:val="18"/>
+          <w:szCs w:val="18"/>
+        </w:rPr>
+        <w:t>zdolności</w:t>
       </w:r>
     </w:p>
     <w:p>
@@ -4129,14 +4473,21 @@
           <w:sz w:val="18"/>
           <w:szCs w:val="18"/>
         </w:rPr>
-        <w:t>Efektywna obr</w:t>
-      </w:r>
-      <w:r>
-        <w:rPr>
-          <w:sz w:val="18"/>
-          <w:szCs w:val="18"/>
-        </w:rPr>
-        <w:t>ona +0,</w:t>
+        <w:t xml:space="preserve">Efektywna </w:t>
+      </w:r>
+      <w:r>
+        <w:rPr>
+          <w:sz w:val="18"/>
+          <w:szCs w:val="18"/>
+        </w:rPr>
+        <w:t>Zbroja</w:t>
+      </w:r>
+      <w:r>
+        <w:rPr>
+          <w:sz w:val="18"/>
+          <w:szCs w:val="18"/>
+        </w:rPr>
+        <w:t>+0,</w:t>
       </w:r>
       <w:r>
         <w:rPr>
@@ -4166,7 +4517,28 @@
           <w:sz w:val="18"/>
           <w:szCs w:val="18"/>
         </w:rPr>
-        <w:t>Efektywna obrona +0,25</w:t>
+        <w:t xml:space="preserve">Efektywna </w:t>
+      </w:r>
+      <w:r>
+        <w:rPr>
+          <w:sz w:val="18"/>
+          <w:szCs w:val="18"/>
+        </w:rPr>
+        <w:t>Zbroja</w:t>
+      </w:r>
+      <w:r>
+        <w:rPr>
+          <w:sz w:val="18"/>
+          <w:szCs w:val="18"/>
+        </w:rPr>
+        <w:t xml:space="preserve"> </w:t>
+      </w:r>
+      <w:r>
+        <w:rPr>
+          <w:sz w:val="18"/>
+          <w:szCs w:val="18"/>
+        </w:rPr>
+        <w:t>+0,25</w:t>
       </w:r>
     </w:p>
     <w:p>
@@ -4189,7 +4561,28 @@
           <w:sz w:val="18"/>
           <w:szCs w:val="18"/>
         </w:rPr>
-        <w:t>Efektywna obrona +1</w:t>
+        <w:t xml:space="preserve">Efektywna </w:t>
+      </w:r>
+      <w:r>
+        <w:rPr>
+          <w:sz w:val="18"/>
+          <w:szCs w:val="18"/>
+        </w:rPr>
+        <w:t>Zbroja</w:t>
+      </w:r>
+      <w:r>
+        <w:rPr>
+          <w:sz w:val="18"/>
+          <w:szCs w:val="18"/>
+        </w:rPr>
+        <w:t xml:space="preserve"> </w:t>
+      </w:r>
+      <w:r>
+        <w:rPr>
+          <w:sz w:val="18"/>
+          <w:szCs w:val="18"/>
+        </w:rPr>
+        <w:t>+1</w:t>
       </w:r>
     </w:p>
     <w:p>
@@ -4251,29 +4644,6 @@
           <w:sz w:val="18"/>
           <w:szCs w:val="18"/>
         </w:rPr>
-        <w:t xml:space="preserve">Strażnik: </w:t>
-      </w:r>
-      <w:r>
-        <w:rPr>
-          <w:sz w:val="18"/>
-          <w:szCs w:val="18"/>
-        </w:rPr>
-        <w:t>Patrz broń</w:t>
-      </w:r>
-    </w:p>
-    <w:p>
-      <w:pPr>
-        <w:spacing w:after="0"/>
-        <w:rPr>
-          <w:sz w:val="18"/>
-          <w:szCs w:val="18"/>
-        </w:rPr>
-      </w:pPr>
-      <w:r>
-        <w:rPr>
-          <w:sz w:val="18"/>
-          <w:szCs w:val="18"/>
-        </w:rPr>
         <w:t xml:space="preserve">Kontratak: </w:t>
       </w:r>
       <w:r>
@@ -4341,6 +4711,13 @@
         </w:rPr>
         <w:t>zdolności</w:t>
       </w:r>
+      <w:r>
+        <w:rPr>
+          <w:sz w:val="18"/>
+          <w:szCs w:val="18"/>
+        </w:rPr>
+        <w:t xml:space="preserve"> i patrz broń</w:t>
+      </w:r>
     </w:p>
     <w:p>
       <w:pPr>
@@ -4400,7 +4777,21 @@
           <w:sz w:val="18"/>
           <w:szCs w:val="18"/>
         </w:rPr>
-        <w:t>dolicz 3 do sumy wytrzymałości oddziału</w:t>
+        <w:t xml:space="preserve">dolicz 3 do sumy </w:t>
+      </w:r>
+      <w:r>
+        <w:rPr>
+          <w:sz w:val="18"/>
+          <w:szCs w:val="18"/>
+        </w:rPr>
+        <w:t>Życia</w:t>
+      </w:r>
+      <w:r>
+        <w:rPr>
+          <w:sz w:val="18"/>
+          <w:szCs w:val="18"/>
+        </w:rPr>
+        <w:t xml:space="preserve"> oddziału</w:t>
       </w:r>
       <w:r>
         <w:rPr>
@@ -4607,7 +4998,21 @@
           <w:sz w:val="18"/>
           <w:szCs w:val="18"/>
         </w:rPr>
-        <w:t xml:space="preserve">wynosi: liczba kości * 12 * modyfikator zasięgu * </w:t>
+        <w:t xml:space="preserve">wynosi: liczba kości * </w:t>
+      </w:r>
+      <w:r>
+        <w:rPr>
+          <w:sz w:val="18"/>
+          <w:szCs w:val="18"/>
+        </w:rPr>
+        <w:t>6</w:t>
+      </w:r>
+      <w:r>
+        <w:rPr>
+          <w:sz w:val="18"/>
+          <w:szCs w:val="18"/>
+        </w:rPr>
+        <w:t xml:space="preserve"> * modyfikator zasięgu * </w:t>
       </w:r>
       <w:r>
         <w:rPr>
@@ -4636,6 +5041,29 @@
           <w:szCs w:val="18"/>
         </w:rPr>
         <w:t xml:space="preserve"> za każdą broń</w:t>
+      </w:r>
+    </w:p>
+    <w:p>
+      <w:pPr>
+        <w:spacing w:after="0"/>
+        <w:rPr>
+          <w:sz w:val="18"/>
+          <w:szCs w:val="18"/>
+        </w:rPr>
+      </w:pPr>
+      <w:r>
+        <w:rPr>
+          <w:sz w:val="18"/>
+          <w:szCs w:val="18"/>
+        </w:rPr>
+        <w:t xml:space="preserve">Koszt najdroższego profilu policz </w:t>
+      </w:r>
+      <w:r>
+        <w:rPr>
+          <w:sz w:val="18"/>
+          <w:szCs w:val="18"/>
+        </w:rPr>
+        <w:t>dwukrotnie.</w:t>
       </w:r>
     </w:p>
     <w:p>
@@ -4794,7 +5222,14 @@
                 <w:sz w:val="18"/>
                 <w:szCs w:val="18"/>
               </w:rPr>
-              <w:t>0,6</w:t>
+              <w:t>0,</w:t>
+            </w:r>
+            <w:r>
+              <w:rPr>
+                <w:sz w:val="18"/>
+                <w:szCs w:val="18"/>
+              </w:rPr>
+              <w:t>5</w:t>
             </w:r>
           </w:p>
         </w:tc>
@@ -4815,7 +5250,7 @@
                 <w:sz w:val="18"/>
                 <w:szCs w:val="18"/>
               </w:rPr>
-              <w:t>1</w:t>
+              <w:t>0,6</w:t>
             </w:r>
           </w:p>
         </w:tc>
@@ -4836,7 +5271,7 @@
                 <w:sz w:val="18"/>
                 <w:szCs w:val="18"/>
               </w:rPr>
-              <w:t>0,6</w:t>
+              <w:t>1</w:t>
             </w:r>
           </w:p>
         </w:tc>
@@ -5383,15 +5818,418 @@
           <w:sz w:val="18"/>
           <w:szCs w:val="18"/>
         </w:rPr>
-        <w:t xml:space="preserve">Strażnik: </w:t>
-      </w:r>
-      <w:r>
-        <w:rPr>
-          <w:sz w:val="18"/>
-          <w:szCs w:val="18"/>
-        </w:rPr>
-        <w:t>Efektywna siła +0,25</w:t>
-      </w:r>
+        <w:t>Sam</w:t>
+      </w:r>
+      <w:r>
+        <w:rPr>
+          <w:sz w:val="18"/>
+          <w:szCs w:val="18"/>
+        </w:rPr>
+        <w:t>olot: Modyfikator zasięgu: 0/0/1,6</w:t>
+      </w:r>
+    </w:p>
+    <w:p>
+      <w:pPr>
+        <w:spacing w:after="0"/>
+        <w:rPr>
+          <w:sz w:val="18"/>
+          <w:szCs w:val="18"/>
+        </w:rPr>
+      </w:pPr>
+    </w:p>
+    <w:p>
+      <w:pPr>
+        <w:spacing w:after="0"/>
+        <w:rPr>
+          <w:sz w:val="18"/>
+          <w:szCs w:val="18"/>
+        </w:rPr>
+      </w:pPr>
+      <w:r>
+        <w:rPr>
+          <w:b/>
+          <w:bCs/>
+          <w:sz w:val="18"/>
+          <w:szCs w:val="18"/>
+        </w:rPr>
+        <w:t>Dostosowanie gry:</w:t>
+      </w:r>
+      <w:r>
+        <w:rPr>
+          <w:sz w:val="18"/>
+          <w:szCs w:val="18"/>
+        </w:rPr>
+        <w:br/>
+      </w:r>
+      <w:r>
+        <w:rPr>
+          <w:b/>
+          <w:bCs/>
+          <w:sz w:val="18"/>
+          <w:szCs w:val="18"/>
+        </w:rPr>
+        <w:t>Duże gry:</w:t>
+      </w:r>
+      <w:r>
+        <w:rPr>
+          <w:sz w:val="18"/>
+          <w:szCs w:val="18"/>
+        </w:rPr>
+        <w:t xml:space="preserve"> Jeżeli chce</w:t>
+      </w:r>
+      <w:r>
+        <w:rPr>
+          <w:sz w:val="18"/>
+          <w:szCs w:val="18"/>
+        </w:rPr>
+        <w:t>cie grać dużą liczbą modeli</w:t>
+      </w:r>
+      <w:r>
+        <w:rPr>
+          <w:sz w:val="18"/>
+          <w:szCs w:val="18"/>
+        </w:rPr>
+        <w:t xml:space="preserve">, </w:t>
+      </w:r>
+      <w:r>
+        <w:rPr>
+          <w:sz w:val="18"/>
+          <w:szCs w:val="18"/>
+        </w:rPr>
+        <w:t xml:space="preserve">wygodnie jest </w:t>
+      </w:r>
+      <w:r>
+        <w:rPr>
+          <w:sz w:val="18"/>
+          <w:szCs w:val="18"/>
+        </w:rPr>
+        <w:t>cały</w:t>
+      </w:r>
+      <w:r>
+        <w:rPr>
+          <w:sz w:val="18"/>
+          <w:szCs w:val="18"/>
+        </w:rPr>
+        <w:t xml:space="preserve"> oddział potraktować jako jeden </w:t>
+      </w:r>
+      <w:r>
+        <w:rPr>
+          <w:sz w:val="18"/>
+          <w:szCs w:val="18"/>
+        </w:rPr>
+        <w:t xml:space="preserve">duży </w:t>
+      </w:r>
+      <w:r>
+        <w:rPr>
+          <w:sz w:val="18"/>
+          <w:szCs w:val="18"/>
+        </w:rPr>
+        <w:t>„model”</w:t>
+      </w:r>
+      <w:r>
+        <w:rPr>
+          <w:sz w:val="18"/>
+          <w:szCs w:val="18"/>
+        </w:rPr>
+        <w:t xml:space="preserve"> w</w:t>
+      </w:r>
+      <w:r>
+        <w:rPr>
+          <w:sz w:val="18"/>
+          <w:szCs w:val="18"/>
+        </w:rPr>
+        <w:t xml:space="preserve"> kalkulatorze, a  fizyczne modele traktować jako znacznik ran, bez zmiany </w:t>
+      </w:r>
+      <w:r>
+        <w:rPr>
+          <w:sz w:val="18"/>
+          <w:szCs w:val="18"/>
+        </w:rPr>
+        <w:t>liczby ataków podczas gry</w:t>
+      </w:r>
+      <w:r>
+        <w:rPr>
+          <w:sz w:val="18"/>
+          <w:szCs w:val="18"/>
+        </w:rPr>
+        <w:t>,</w:t>
+      </w:r>
+      <w:r>
+        <w:rPr>
+          <w:sz w:val="18"/>
+          <w:szCs w:val="18"/>
+        </w:rPr>
+        <w:t>. Upewnij się, że wszyscy</w:t>
+      </w:r>
+      <w:r>
+        <w:rPr>
+          <w:sz w:val="18"/>
+          <w:szCs w:val="18"/>
+        </w:rPr>
+        <w:t xml:space="preserve"> gracze się dobrze czują się z takim uproszczeniem.</w:t>
+      </w:r>
+    </w:p>
+    <w:p>
+      <w:pPr>
+        <w:spacing w:after="0"/>
+        <w:rPr>
+          <w:sz w:val="18"/>
+          <w:szCs w:val="18"/>
+        </w:rPr>
+      </w:pPr>
+      <w:r>
+        <w:rPr>
+          <w:sz w:val="18"/>
+          <w:szCs w:val="18"/>
+        </w:rPr>
+        <w:br/>
+      </w:r>
+      <w:r>
+        <w:rPr>
+          <w:b/>
+          <w:bCs/>
+          <w:sz w:val="18"/>
+          <w:szCs w:val="18"/>
+        </w:rPr>
+        <w:t>Małe gry:</w:t>
+      </w:r>
+      <w:r>
+        <w:rPr>
+          <w:sz w:val="18"/>
+          <w:szCs w:val="18"/>
+        </w:rPr>
+        <w:t xml:space="preserve"> </w:t>
+      </w:r>
+      <w:r>
+        <w:rPr>
+          <w:sz w:val="18"/>
+          <w:szCs w:val="18"/>
+        </w:rPr>
+        <w:t xml:space="preserve">Przy grze na kilka modeli, warto dać im </w:t>
+      </w:r>
+      <w:r>
+        <w:rPr>
+          <w:sz w:val="18"/>
+          <w:szCs w:val="18"/>
+        </w:rPr>
+        <w:t>dwa razy większ</w:t>
+      </w:r>
+      <w:r>
+        <w:rPr>
+          <w:sz w:val="18"/>
+          <w:szCs w:val="18"/>
+        </w:rPr>
+        <w:t xml:space="preserve">e Życie </w:t>
+      </w:r>
+      <w:r>
+        <w:rPr>
+          <w:sz w:val="18"/>
+          <w:szCs w:val="18"/>
+        </w:rPr>
+        <w:t>niż zwykle</w:t>
+      </w:r>
+      <w:r>
+        <w:rPr>
+          <w:sz w:val="18"/>
+          <w:szCs w:val="18"/>
+        </w:rPr>
+        <w:t>; o</w:t>
+      </w:r>
+      <w:r>
+        <w:rPr>
+          <w:sz w:val="18"/>
+          <w:szCs w:val="18"/>
+        </w:rPr>
+        <w:t xml:space="preserve">raz zmienić zdolność </w:t>
+      </w:r>
+      <w:r>
+        <w:rPr>
+          <w:sz w:val="18"/>
+          <w:szCs w:val="18"/>
+        </w:rPr>
+        <w:t>Obszarowa</w:t>
+      </w:r>
+      <w:r>
+        <w:rPr>
+          <w:b/>
+          <w:bCs/>
+          <w:sz w:val="18"/>
+          <w:szCs w:val="18"/>
+        </w:rPr>
+        <w:t>:</w:t>
+      </w:r>
+      <w:r>
+        <w:rPr>
+          <w:sz w:val="18"/>
+          <w:szCs w:val="18"/>
+        </w:rPr>
+        <w:t xml:space="preserve"> Atakujesz grupę figurek które: widzisz, są w zasięgu broni, są miarkę od siebie i widzą się wzajemnie bez osłony. Po Tobie przeciwnik może dodać figurki  do grupy. Jeżeli kilka z nich należy do jednego oddziału, rzuć kośćmi razem.</w:t>
+      </w:r>
+    </w:p>
+    <w:p>
+      <w:pPr>
+        <w:spacing w:after="0"/>
+        <w:rPr>
+          <w:sz w:val="18"/>
+          <w:szCs w:val="18"/>
+        </w:rPr>
+      </w:pPr>
+    </w:p>
+    <w:p>
+      <w:pPr>
+        <w:spacing w:after="0"/>
+        <w:rPr>
+          <w:sz w:val="18"/>
+          <w:szCs w:val="18"/>
+        </w:rPr>
+      </w:pPr>
+      <w:r>
+        <w:rPr>
+          <w:b/>
+          <w:bCs/>
+          <w:sz w:val="18"/>
+          <w:szCs w:val="18"/>
+        </w:rPr>
+        <w:t>Niszczenie celów:</w:t>
+      </w:r>
+      <w:r>
+        <w:rPr>
+          <w:sz w:val="18"/>
+          <w:szCs w:val="18"/>
+        </w:rPr>
+        <w:t xml:space="preserve"> Możecie</w:t>
+      </w:r>
+      <w:r>
+        <w:rPr>
+          <w:sz w:val="18"/>
+          <w:szCs w:val="18"/>
+        </w:rPr>
+        <w:t xml:space="preserve"> przed grą oznaczyć część celów do zniszczenia –</w:t>
+      </w:r>
+      <w:r>
+        <w:rPr>
+          <w:sz w:val="18"/>
+          <w:szCs w:val="18"/>
+        </w:rPr>
+        <w:t xml:space="preserve"> zostają zajęte przez zadanie rany, mają 5 </w:t>
+      </w:r>
+      <w:r>
+        <w:rPr>
+          <w:sz w:val="18"/>
+          <w:szCs w:val="18"/>
+        </w:rPr>
+        <w:t>Zbroi</w:t>
+      </w:r>
+      <w:r>
+        <w:rPr>
+          <w:sz w:val="18"/>
+          <w:szCs w:val="18"/>
+        </w:rPr>
+        <w:t>.</w:t>
+      </w:r>
+      <w:r>
+        <w:rPr>
+          <w:sz w:val="18"/>
+          <w:szCs w:val="18"/>
+        </w:rPr>
+        <w:br/>
+      </w:r>
+      <w:r>
+        <w:rPr>
+          <w:sz w:val="18"/>
+          <w:szCs w:val="18"/>
+        </w:rPr>
+        <w:br/>
+      </w:r>
+      <w:r>
+        <w:rPr>
+          <w:b/>
+          <w:bCs/>
+          <w:sz w:val="18"/>
+          <w:szCs w:val="18"/>
+        </w:rPr>
+        <w:t xml:space="preserve">Niszczenie </w:t>
+      </w:r>
+      <w:r>
+        <w:rPr>
+          <w:b/>
+          <w:bCs/>
+          <w:sz w:val="18"/>
+          <w:szCs w:val="18"/>
+        </w:rPr>
+        <w:t>planszy:</w:t>
+      </w:r>
+      <w:r>
+        <w:rPr>
+          <w:sz w:val="18"/>
+          <w:szCs w:val="18"/>
+        </w:rPr>
+        <w:t xml:space="preserve"> Możecie przed grą oznaczyć część elementów terenu jako z</w:t>
+      </w:r>
+      <w:r>
+        <w:rPr>
+          <w:sz w:val="18"/>
+          <w:szCs w:val="18"/>
+        </w:rPr>
+        <w:t xml:space="preserve">niszczalne. </w:t>
+      </w:r>
+      <w:r>
+        <w:rPr>
+          <w:sz w:val="18"/>
+          <w:szCs w:val="18"/>
+        </w:rPr>
+        <w:t xml:space="preserve">Przypiszcie im pasujące wartości </w:t>
+      </w:r>
+      <w:r>
+        <w:rPr>
+          <w:sz w:val="18"/>
+          <w:szCs w:val="18"/>
+        </w:rPr>
+        <w:t>Zbroi i Życia</w:t>
+      </w:r>
+    </w:p>
+    <w:p>
+      <w:pPr>
+        <w:spacing w:after="0"/>
+        <w:rPr>
+          <w:sz w:val="18"/>
+          <w:szCs w:val="18"/>
+        </w:rPr>
+      </w:pPr>
+    </w:p>
+    <w:p>
+      <w:pPr>
+        <w:spacing w:after="0"/>
+        <w:rPr>
+          <w:sz w:val="18"/>
+          <w:szCs w:val="18"/>
+        </w:rPr>
+      </w:pPr>
+      <w:r>
+        <w:rPr>
+          <w:b/>
+          <w:bCs/>
+          <w:sz w:val="18"/>
+          <w:szCs w:val="18"/>
+        </w:rPr>
+        <w:t>Dla bardziej zaawansowanych graczy</w:t>
+      </w:r>
+      <w:r>
+        <w:rPr>
+          <w:sz w:val="18"/>
+          <w:szCs w:val="18"/>
+        </w:rPr>
+        <w:t xml:space="preserve"> można dopuścić możliwość ataku przed ruchem.</w:t>
+      </w:r>
+    </w:p>
+    <w:p>
+      <w:pPr>
+        <w:spacing w:after="0"/>
+        <w:rPr>
+          <w:sz w:val="18"/>
+          <w:szCs w:val="18"/>
+        </w:rPr>
+      </w:pPr>
     </w:p>
     <w:sectPr>
       <w:pgSz w:w="11906" w:h="16838"/>
@@ -5455,7 +6293,7 @@
 
 <file path=word/numbering.xml><?xml version="1.0" encoding="utf-8"?>
 <w:numbering xmlns:wpc="http://schemas.microsoft.com/office/word/2010/wordprocessingCanvas" xmlns:cx="http://schemas.microsoft.com/office/drawing/2014/chartex" xmlns:cx1="http://schemas.microsoft.com/office/drawing/2015/9/8/chartex" xmlns:cx2="http://schemas.microsoft.com/office/drawing/2015/10/21/chartex" xmlns:cx3="http://schemas.microsoft.com/office/drawing/2016/5/9/chartex" xmlns:cx4="http://schemas.microsoft.com/office/drawing/2016/5/10/chartex" xmlns:cx5="http://schemas.microsoft.com/office/drawing/2016/5/11/chartex" xmlns:cx6="http://schemas.microsoft.com/office/drawing/2016/5/12/chartex" xmlns:cx7="http://schemas.microsoft.com/office/drawing/2016/5/13/chartex" xmlns:cx8="http://schemas.microsoft.com/office/drawing/2016/5/14/chartex" xmlns:mc="http://schemas.openxmlformats.org/markup-compatibility/2006" xmlns:aink="http://schemas.microsoft.com/office/drawing/2016/ink" xmlns:am3d="http://schemas.microsoft.com/office/drawing/2017/model3d" xmlns:o="urn:schemas-microsoft-com:office:office" xmlns:oel="http://schemas.microsoft.com/office/2019/extlst" xmlns:r="http://schemas.openxmlformats.org/officeDocument/2006/relationships" xmlns:m="http://schemas.openxmlformats.org/officeDocument/2006/math" xmlns:v="urn:schemas-microsoft-com:vml" xmlns:wp14="http://schemas.microsoft.com/office/word/2010/wordprocessingDrawing" xmlns:wp="http://schemas.openxmlformats.org/drawingml/2006/wordprocessingDrawing" xmlns:w10="urn:schemas-microsoft-com:office:word" xmlns:w="http://schemas.openxmlformats.org/wordprocessingml/2006/main" xmlns:w14="http://schemas.microsoft.com/office/word/2010/wordml" xmlns:w15="http://schemas.microsoft.com/office/word/2012/wordml" xmlns:w16cei="http://schemas.microsoft.com/office/word/2026/wordml/cei" xmlns:w16cex="http://schemas.microsoft.com/office/word/2018/wordml/cex" xmlns:w16cid="http://schemas.microsoft.com/office/word/2016/wordml/cid" xmlns:w16="http://schemas.microsoft.com/office/word/2018/wordml" xmlns:w16du="http://schemas.microsoft.com/office/word/2023/wordml/word16du" xmlns:w16sdtdh="http://schemas.microsoft.com/office/word/2020/wordml/sdtdatahash" xmlns:w16sdtfl="http://schemas.microsoft.com/office/word/2024/wordml/sdtformatlock" xmlns:w16se="http://schemas.microsoft.com/office/word/2015/wordml/symex" xmlns:wpg="http://schemas.microsoft.com/office/word/2010/wordprocessingGroup" xmlns:wpi="http://schemas.microsoft.com/office/word/2010/wordprocessingInk" xmlns:wne="http://schemas.microsoft.com/office/word/2006/wordml" xmlns:wps="http://schemas.microsoft.com/office/word/2010/wordprocessingShape" mc:Ignorable="w14 w15 w16se w16cid w16 w16cex w16sdtdh w16sdtfl w16du wp14">
-  <w:abstractNum w:abstractNumId="1" w15:restartNumberingAfterBreak="0">
+  <w:abstractNum w:abstractNumId="0" w15:restartNumberingAfterBreak="0">
     <w:nsid w:val="1F1A59AE"/>
     <w:multiLevelType w:val="hybridMultilevel"/>
     <w:tmpl w:val="57AA667C"/>
@@ -5568,7 +6406,7 @@
       </w:rPr>
     </w:lvl>
   </w:abstractNum>
-  <w:abstractNum w:abstractNumId="2" w15:restartNumberingAfterBreak="0">
+  <w:abstractNum w:abstractNumId="1" w15:restartNumberingAfterBreak="0">
     <w:nsid w:val="21CF49F5"/>
     <w:multiLevelType w:val="hybridMultilevel"/>
     <w:tmpl w:val="6688FAD4"/>
@@ -5681,7 +6519,7 @@
       </w:rPr>
     </w:lvl>
   </w:abstractNum>
-  <w:abstractNum w:abstractNumId="3" w15:restartNumberingAfterBreak="0">
+  <w:abstractNum w:abstractNumId="2" w15:restartNumberingAfterBreak="0">
     <w:nsid w:val="24440538"/>
     <w:multiLevelType w:val="hybridMultilevel"/>
     <w:tmpl w:val="E3FCE9DC"/>
@@ -5794,7 +6632,7 @@
       </w:rPr>
     </w:lvl>
   </w:abstractNum>
-  <w:abstractNum w:abstractNumId="4" w15:restartNumberingAfterBreak="0">
+  <w:abstractNum w:abstractNumId="3" w15:restartNumberingAfterBreak="0">
     <w:nsid w:val="30E202D3"/>
     <w:multiLevelType w:val="hybridMultilevel"/>
     <w:tmpl w:val="C7A0F63A"/>
@@ -5907,7 +6745,7 @@
       </w:rPr>
     </w:lvl>
   </w:abstractNum>
-  <w:abstractNum w:abstractNumId="5" w15:restartNumberingAfterBreak="0">
+  <w:abstractNum w:abstractNumId="4" w15:restartNumberingAfterBreak="0">
     <w:nsid w:val="313D3CB4"/>
     <w:multiLevelType w:val="hybridMultilevel"/>
     <w:tmpl w:val="05EEF8CE"/>
@@ -6020,7 +6858,7 @@
       </w:rPr>
     </w:lvl>
   </w:abstractNum>
-  <w:abstractNum w:abstractNumId="6" w15:restartNumberingAfterBreak="0">
+  <w:abstractNum w:abstractNumId="5" w15:restartNumberingAfterBreak="0">
     <w:nsid w:val="35036806"/>
     <w:multiLevelType w:val="hybridMultilevel"/>
     <w:tmpl w:val="E0C472D2"/>
@@ -6133,7 +6971,7 @@
       </w:rPr>
     </w:lvl>
   </w:abstractNum>
-  <w:abstractNum w:abstractNumId="7" w15:restartNumberingAfterBreak="0">
+  <w:abstractNum w:abstractNumId="6" w15:restartNumberingAfterBreak="0">
     <w:nsid w:val="3BE4574F"/>
     <w:multiLevelType w:val="hybridMultilevel"/>
     <w:tmpl w:val="6F347CA8"/>
@@ -6246,7 +7084,7 @@
       </w:rPr>
     </w:lvl>
   </w:abstractNum>
-  <w:abstractNum w:abstractNumId="8" w15:restartNumberingAfterBreak="0">
+  <w:abstractNum w:abstractNumId="7" w15:restartNumberingAfterBreak="0">
     <w:nsid w:val="4A456DF1"/>
     <w:multiLevelType w:val="hybridMultilevel"/>
     <w:tmpl w:val="2668E528"/>
@@ -6332,7 +7170,7 @@
       </w:pPr>
     </w:lvl>
   </w:abstractNum>
-  <w:abstractNum w:abstractNumId="9" w15:restartNumberingAfterBreak="0">
+  <w:abstractNum w:abstractNumId="8" w15:restartNumberingAfterBreak="0">
     <w:nsid w:val="526356B5"/>
     <w:multiLevelType w:val="multilevel"/>
     <w:tmpl w:val="6E3ED9A8"/>
@@ -6481,7 +7319,7 @@
       </w:rPr>
     </w:lvl>
   </w:abstractNum>
-  <w:abstractNum w:abstractNumId="10" w15:restartNumberingAfterBreak="0">
+  <w:abstractNum w:abstractNumId="9" w15:restartNumberingAfterBreak="0">
     <w:nsid w:val="52AC6A4E"/>
     <w:multiLevelType w:val="hybridMultilevel"/>
     <w:tmpl w:val="1138185A"/>
@@ -6567,7 +7405,7 @@
       </w:pPr>
     </w:lvl>
   </w:abstractNum>
-  <w:abstractNum w:abstractNumId="11" w15:restartNumberingAfterBreak="0">
+  <w:abstractNum w:abstractNumId="10" w15:restartNumberingAfterBreak="0">
     <w:nsid w:val="546866E0"/>
     <w:multiLevelType w:val="hybridMultilevel"/>
     <w:tmpl w:val="E7068930"/>
@@ -6680,7 +7518,7 @@
       </w:rPr>
     </w:lvl>
   </w:abstractNum>
-  <w:abstractNum w:abstractNumId="12" w15:restartNumberingAfterBreak="0">
+  <w:abstractNum w:abstractNumId="11" w15:restartNumberingAfterBreak="0">
     <w:nsid w:val="6CE02867"/>
     <w:multiLevelType w:val="multilevel"/>
     <w:tmpl w:val="74AEADF4"/>
@@ -6829,7 +7667,7 @@
       </w:rPr>
     </w:lvl>
   </w:abstractNum>
-  <w:abstractNum w:abstractNumId="13" w15:restartNumberingAfterBreak="0">
+  <w:abstractNum w:abstractNumId="12" w15:restartNumberingAfterBreak="0">
     <w:nsid w:val="70356216"/>
     <w:multiLevelType w:val="hybridMultilevel"/>
     <w:tmpl w:val="7F2A022A"/>
@@ -6943,43 +7781,43 @@
     </w:lvl>
   </w:abstractNum>
   <w:num w:numId="1" w16cid:durableId="291787832">
+    <w:abstractNumId w:val="4"/>
+  </w:num>
+  <w:num w:numId="2" w16cid:durableId="426585881">
+    <w:abstractNumId w:val="0"/>
+  </w:num>
+  <w:num w:numId="3" w16cid:durableId="269044319">
+    <w:abstractNumId w:val="1"/>
+  </w:num>
+  <w:num w:numId="4" w16cid:durableId="1408308384">
+    <w:abstractNumId w:val="8"/>
+  </w:num>
+  <w:num w:numId="5" w16cid:durableId="109279683">
+    <w:abstractNumId w:val="11"/>
+  </w:num>
+  <w:num w:numId="6" w16cid:durableId="657147143">
+    <w:abstractNumId w:val="9"/>
+  </w:num>
+  <w:num w:numId="7" w16cid:durableId="1869828609">
+    <w:abstractNumId w:val="7"/>
+  </w:num>
+  <w:num w:numId="8" w16cid:durableId="816461334">
     <w:abstractNumId w:val="5"/>
   </w:num>
-  <w:num w:numId="2" w16cid:durableId="426585881">
-    <w:abstractNumId w:val="1"/>
-  </w:num>
-  <w:num w:numId="3" w16cid:durableId="269044319">
-    <w:abstractNumId w:val="2"/>
-  </w:num>
-  <w:num w:numId="4" w16cid:durableId="1408308384">
-    <w:abstractNumId w:val="9"/>
-  </w:num>
-  <w:num w:numId="5" w16cid:durableId="109279683">
+  <w:num w:numId="9" w16cid:durableId="1623537510">
     <w:abstractNumId w:val="12"/>
   </w:num>
-  <w:num w:numId="6" w16cid:durableId="657147143">
+  <w:num w:numId="10" w16cid:durableId="1335767445">
     <w:abstractNumId w:val="10"/>
   </w:num>
-  <w:num w:numId="7" w16cid:durableId="1869828609">
-    <w:abstractNumId w:val="8"/>
-  </w:num>
-  <w:num w:numId="8" w16cid:durableId="816461334">
+  <w:num w:numId="11" w16cid:durableId="90976186">
     <w:abstractNumId w:val="6"/>
   </w:num>
-  <w:num w:numId="9" w16cid:durableId="1623537510">
-    <w:abstractNumId w:val="13"/>
-  </w:num>
-  <w:num w:numId="10" w16cid:durableId="1335767445">
-    <w:abstractNumId w:val="11"/>
-  </w:num>
-  <w:num w:numId="11" w16cid:durableId="90976186">
-    <w:abstractNumId w:val="7"/>
-  </w:num>
   <w:num w:numId="12" w16cid:durableId="2008825223">
-    <w:abstractNumId w:val="4"/>
+    <w:abstractNumId w:val="3"/>
   </w:num>
   <w:num w:numId="13" w16cid:durableId="300035252">
-    <w:abstractNumId w:val="3"/>
+    <w:abstractNumId w:val="2"/>
   </w:num>
 </w:numbering>
 </file>

</xml_diff>